<commit_message>
Prepare v1.0.0 for publication and Zenodo archival
- Bump version to 1.0.0 across pyproject, CITATION.cff, codemeta.json
- Add .zenodo.json for GitHub-Zenodo DOI minting (GPL-3.0-only, 4 creators)
- Correct 'operational-Taylor' -> 'order-truncated imaginary (OTI)' in metadata
- Remake templates/ (minimal + constitutive) to match current contract schema
- Consolidate duplicate starter templates/examples to canonical root copies
- Rewrite user manual (.docx) covering current implementation, CLI, GUI, tutorials
- Update CHANGELOG for 1.0.0
</commit_message>
<xml_diff>
--- a/UMAT_Source_transformation_user_manual.docx
+++ b/UMAT_Source_transformation_user_manual.docx
@@ -4,62 +4,97 @@
   <w:body>
     <w:p>
       <w:pPr>
-        <w:jc w:val="left"/>
+        <w:jc w:val="center"/>
       </w:pPr>
       <w:r>
         <w:rPr>
           <w:b/>
-          <w:color w:val="F15A22"/>
-          <w:sz w:val="56"/>
+          <w:color w:val="1F3B73"/>
+          <w:sz w:val="68"/>
         </w:rPr>
-        <w:t>UMAT to UMAT-OTI</w:t>
+        <w:t>UMAT-OTI</w:t>
+      </w:r>
+    </w:p>
+    <w:p>
+      <w:pPr>
+        <w:jc w:val="center"/>
+      </w:pPr>
+      <w:r>
+        <w:rPr>
+          <w:color w:val="555555"/>
+          <w:sz w:val="40"/>
+        </w:rPr>
+        <w:t>User Manual</w:t>
+      </w:r>
+    </w:p>
+    <w:p>
+      <w:pPr>
+        <w:jc w:val="center"/>
+      </w:pPr>
+      <w:r>
+        <w:rPr>
+          <w:sz w:val="26"/>
+        </w:rPr>
+        <w:t>Automatic differentiation of Abaqus UMAT material tangents</w:t>
+        <w:br/>
+        <w:t>using order-truncated imaginary (OTI) numbers</w:t>
+      </w:r>
+    </w:p>
+    <w:p>
+      <w:pPr>
+        <w:jc w:val="center"/>
+      </w:pPr>
+      <w:r>
+        <w:rPr>
+          <w:b/>
+          <w:sz w:val="24"/>
+        </w:rPr>
+        <w:br/>
+        <w:t>Version 1.0.0</w:t>
+        <w:br/>
+      </w:r>
+      <w:r>
+        <w:rPr>
+          <w:color w:val="555555"/>
+          <w:sz w:val="20"/>
+        </w:rPr>
+        <w:t>Released under the GNU General Public License v3.0 (GPL-3.0-only)</w:t>
       </w:r>
     </w:p>
     <w:p>
       <w:r>
-        <w:rPr>
-          <w:color w:val="1A1A1A"/>
-          <w:sz w:val="30"/>
-        </w:rPr>
-        <w:t>User Guide: how the tool works and how to use it</w:t>
+        <w:br w:type="page"/>
       </w:r>
     </w:p>
-    <w:p>
-      <w:r>
-        <w:rPr>
-          <w:i/>
-          <w:color w:val="606060"/>
-          <w:sz w:val="20"/>
-        </w:rPr>
-        <w:t>Updated July 2026</w:t>
-      </w:r>
-    </w:p>
-    <w:p/>
     <w:p>
       <w:pPr>
         <w:pStyle w:val="Heading1"/>
       </w:pPr>
       <w:r>
-        <w:rPr>
-          <w:color w:val="F15A22"/>
-        </w:rPr>
-        <w:t>1. What the tool does</w:t>
+        <w:t>1. Overview</w:t>
       </w:r>
     </w:p>
     <w:p>
       <w:r>
-        <w:rPr>
-          <w:b w:val="0"/>
-        </w:rPr>
-        <w:t>This tool takes an Abaqus UMAT and rewrites it so that it computes its consistent tangent, DDSDDE, exactly. It does this with OTI hyperdual automatic differentiation, so you never have to derive or hand code the Jacobian. The transformed UMAT gives the same stress as before and, in addition, an exact tangent.</w:t>
+        <w:t>UMAT-OTI transforms Abaqus user-material subroutine (UMAT) Fortran source so that the consistent material tangent (DDSDDE) is computed by order-truncated imaginary (OTI) automatic differentiation instead of hand-coded or finite-difference derivatives. The transformation is driven by a compact JSON contract that describes which variable is seeded, which output is differentiated, and where the result is written back into the source.</w:t>
       </w:r>
     </w:p>
     <w:p>
       <w:r>
-        <w:rPr>
-          <w:b w:val="0"/>
-        </w:rPr>
-        <w:t>It works on:</w:t>
+        <w:t>The OTI method promotes selected real quantities to order-truncated imaginary numbers, propagates them through the existing constitutive computation, and extracts exact derivatives from the imaginary components. Applied to a UMAT, this yields a consistent tangent stiffness that matches the stress update without the algebra and maintenance cost of a hand-differentiated Jacobian.</w:t>
+      </w:r>
+    </w:p>
+    <w:p>
+      <w:r>
+        <w:t>The tool is delivered as a standalone source bundle. It contains the full transformation runtime, a Streamlit GUI, command-line entry points, helper scripts, worked examples, reusable JSON templates, and a set of completed benchmark contracts.</w:t>
+      </w:r>
+    </w:p>
+    <w:p>
+      <w:pPr>
+        <w:pStyle w:val="Heading2"/>
+      </w:pPr>
+      <w:r>
+        <w:t>What this manual covers</w:t>
       </w:r>
     </w:p>
     <w:p>
@@ -67,7 +102,7 @@
         <w:pStyle w:val="ListBullet"/>
       </w:pPr>
       <w:r>
-        <w:t>Single file UMATs and UMATs split across many files.</w:t>
+        <w:t>How to install and run the toolkit.</w:t>
       </w:r>
     </w:p>
     <w:p>
@@ -75,7 +110,7 @@
         <w:pStyle w:val="ListBullet"/>
       </w:pPr>
       <w:r>
-        <w:t>Small strain UMATs, seeded on the strain increment DSTRAN.</w:t>
+        <w:t>The compact JSON contract schema (required, optional, and advanced fields).</w:t>
       </w:r>
     </w:p>
     <w:p>
@@ -83,7 +118,7 @@
         <w:pStyle w:val="ListBullet"/>
       </w:pPr>
       <w:r>
-        <w:t>Finite strain UMATs, seeded on the deformation gradient DFGRD1.</w:t>
+        <w:t>Every command-line and GUI entry point.</w:t>
       </w:r>
     </w:p>
     <w:p>
@@ -91,7 +126,23 @@
         <w:pStyle w:val="ListBullet"/>
       </w:pPr>
       <w:r>
-        <w:t>Higher order tangents, the second, third, and fourth derivatives, in a single run.</w:t>
+        <w:t>A step-by-step tutorial for transforming a new UMAT.</w:t>
+      </w:r>
+    </w:p>
+    <w:p>
+      <w:pPr>
+        <w:pStyle w:val="ListBullet"/>
+      </w:pPr>
+      <w:r>
+        <w:t>The bundled examples, templates, and completed benchmark set.</w:t>
+      </w:r>
+    </w:p>
+    <w:p>
+      <w:pPr>
+        <w:pStyle w:val="ListBullet"/>
+      </w:pPr>
+      <w:r>
+        <w:t>Validation against Abaqus, troubleshooting, and current limitations.</w:t>
       </w:r>
     </w:p>
     <w:p>
@@ -99,113 +150,12 @@
         <w:pStyle w:val="Heading1"/>
       </w:pPr>
       <w:r>
-        <w:rPr>
-          <w:color w:val="F15A22"/>
-        </w:rPr>
-        <w:t>2. How to run it</w:t>
+        <w:t>2. Repository Layout</w:t>
       </w:r>
     </w:p>
     <w:p>
       <w:r>
-        <w:rPr>
-          <w:b w:val="0"/>
-        </w:rPr>
-        <w:t>The easiest way is the single page interface. From the root of the project run:</w:t>
-      </w:r>
-    </w:p>
-    <w:p>
-      <w:pPr>
-        <w:pStyle w:val="CodeBlock"/>
-        <w:shd w:val="clear" w:fill="F0F0F0"/>
-      </w:pPr>
-      <w:r>
-        <w:t>streamlit run engine_app.py</w:t>
-      </w:r>
-    </w:p>
-    <w:p>
-      <w:r>
-        <w:rPr>
-          <w:b w:val="0"/>
-        </w:rPr>
-        <w:t>Then open the address it prints, for example http://localhost:8501. You will see one page with an Input panel on the left and an Output panel on the right.</w:t>
-      </w:r>
-    </w:p>
-    <w:p>
-      <w:r>
-        <w:rPr>
-          <w:b w:val="0"/>
-        </w:rPr>
-        <w:t>A command line path is also available for batch runs and for advanced users who want to write the setup file by hand. That is covered in section 7.</w:t>
-      </w:r>
-    </w:p>
-    <w:p>
-      <w:pPr>
-        <w:pStyle w:val="Heading1"/>
-      </w:pPr>
-      <w:r>
-        <w:rPr>
-          <w:color w:val="F15A22"/>
-        </w:rPr>
-        <w:t>3. The workflow, step by step</w:t>
-      </w:r>
-    </w:p>
-    <w:p>
-      <w:pPr>
-        <w:pStyle w:val="ListNumber"/>
-      </w:pPr>
-      <w:r>
-        <w:t>Paste or upload your UMAT source in the Input panel. This is the file that contains SUBROUTINE UMAT. If the UMAT uses other files, upload those in the dependency files box as well.</w:t>
-      </w:r>
-    </w:p>
-    <w:p>
-      <w:pPr>
-        <w:pStyle w:val="ListNumber"/>
-      </w:pPr>
-      <w:r>
-        <w:t>Check the fields the tool has filled in for you. Head routine is umat, the seed is set to Auto detect, and ntens is detected from your code and shown with the reason. In most cases you change nothing.</w:t>
-      </w:r>
-    </w:p>
-    <w:p>
-      <w:pPr>
-        <w:pStyle w:val="ListNumber"/>
-      </w:pPr>
-      <w:r>
-        <w:t>Press Transform. The Output panel shows the transformed UMAT, a Download button, and a short report.</w:t>
-      </w:r>
-    </w:p>
-    <w:p>
-      <w:pPr>
-        <w:pStyle w:val="ListNumber"/>
-      </w:pPr>
-      <w:r>
-        <w:t>Optional. Set the Abaqus command or path, choose a material test, and press Verify in Abaqus. The tool runs the original UMAT and the OTI UMAT and compares the resulting DDSDDE.</w:t>
-      </w:r>
-    </w:p>
-    <w:p>
-      <w:r>
-        <w:rPr>
-          <w:b w:val="0"/>
-        </w:rPr>
-        <w:t>Transform and Verify are separate buttons. You transform once, then you can verify whenever you want without transforming again.</w:t>
-      </w:r>
-    </w:p>
-    <w:p>
-      <w:pPr>
-        <w:pStyle w:val="Heading1"/>
-      </w:pPr>
-      <w:r>
-        <w:rPr>
-          <w:color w:val="F15A22"/>
-        </w:rPr>
-        <w:t>4. What the tool figures out for you</w:t>
-      </w:r>
-    </w:p>
-    <w:p>
-      <w:r>
-        <w:rPr>
-          <w:b w:val="0"/>
-        </w:rPr>
-        <w:t>In the past the user wrote a long setup file, called the contract, by hand. Now the tool reads the source and fills it in. For a single file UMAT it writes the whole contract for you. For a multi file UMAT there is no contract at all.</w:t>
+        <w:t>The bundle is organized as follows:</w:t>
       </w:r>
     </w:p>
     <w:tbl>
@@ -221,27 +171,27 @@
       <w:tr>
         <w:tc>
           <w:tcPr>
-            <w:tcW w:type="dxa" w:w="3744"/>
+            <w:tcW w:type="dxa" w:w="4320"/>
           </w:tcPr>
           <w:p>
             <w:r>
               <w:rPr>
                 <w:b/>
               </w:rPr>
-              <w:t>Setup item</w:t>
+              <w:t>Path</w:t>
             </w:r>
           </w:p>
         </w:tc>
         <w:tc>
           <w:tcPr>
-            <w:tcW w:type="dxa" w:w="5616"/>
+            <w:tcW w:type="dxa" w:w="4320"/>
           </w:tcPr>
           <w:p>
             <w:r>
               <w:rPr>
                 <w:b/>
               </w:rPr>
-              <w:t>How the tool finds it</w:t>
+              <w:t>Purpose</w:t>
             </w:r>
           </w:p>
         </w:tc>
@@ -249,21 +199,28 @@
       <w:tr>
         <w:tc>
           <w:tcPr>
-            <w:tcW w:type="dxa" w:w="3744"/>
+            <w:tcW w:type="dxa" w:w="4320"/>
           </w:tcPr>
           <w:p>
             <w:r>
-              <w:t>Seed variable</w:t>
+              <w:rPr>
+                <w:rFonts w:ascii="Consolas" w:hAnsi="Consolas"/>
+                <w:sz w:val="18"/>
+              </w:rPr>
+              <w:t>src/umat_oti/</w:t>
             </w:r>
           </w:p>
         </w:tc>
         <w:tc>
           <w:tcPr>
-            <w:tcW w:type="dxa" w:w="5616"/>
+            <w:tcW w:type="dxa" w:w="4320"/>
           </w:tcPr>
           <w:p>
             <w:r>
-              <w:t>auto: DSTRAN for small strain, DFGRD1 for finite strain</w:t>
+              <w:rPr>
+                <w:sz w:val="20"/>
+              </w:rPr>
+              <w:t>The full transformation runtime (core, transform, semantic, fortran, oti, umat, validation, reports, app, CLI).</w:t>
             </w:r>
           </w:p>
         </w:tc>
@@ -271,21 +228,28 @@
       <w:tr>
         <w:tc>
           <w:tcPr>
-            <w:tcW w:type="dxa" w:w="3744"/>
+            <w:tcW w:type="dxa" w:w="4320"/>
           </w:tcPr>
           <w:p>
             <w:r>
-              <w:t>ntens (directions)</w:t>
+              <w:rPr>
+                <w:rFonts w:ascii="Consolas" w:hAnsi="Consolas"/>
+                <w:sz w:val="18"/>
+              </w:rPr>
+              <w:t>app.py</w:t>
             </w:r>
           </w:p>
         </w:tc>
         <w:tc>
           <w:tcPr>
-            <w:tcW w:type="dxa" w:w="5616"/>
+            <w:tcW w:type="dxa" w:w="4320"/>
           </w:tcPr>
           <w:p>
             <w:r>
-              <w:t>auto, from the DDSDDE indices or the array sizes, shown with a reason</w:t>
+              <w:rPr>
+                <w:sz w:val="20"/>
+              </w:rPr>
+              <w:t>Streamlit GUI entry point.</w:t>
             </w:r>
           </w:p>
         </w:tc>
@@ -293,21 +257,28 @@
       <w:tr>
         <w:tc>
           <w:tcPr>
-            <w:tcW w:type="dxa" w:w="3744"/>
+            <w:tcW w:type="dxa" w:w="4320"/>
           </w:tcPr>
           <w:p>
             <w:r>
-              <w:t>Variables to lift</w:t>
+              <w:rPr>
+                <w:rFonts w:ascii="Consolas" w:hAnsi="Consolas"/>
+                <w:sz w:val="18"/>
+              </w:rPr>
+              <w:t>templates/</w:t>
             </w:r>
           </w:p>
         </w:tc>
         <w:tc>
           <w:tcPr>
-            <w:tcW w:type="dxa" w:w="5616"/>
+            <w:tcW w:type="dxa" w:w="4320"/>
           </w:tcPr>
           <w:p>
             <w:r>
-              <w:t>auto, from the dataflow that runs from the seed to STRESS</w:t>
+              <w:rPr>
+                <w:sz w:val="20"/>
+              </w:rPr>
+              <w:t>Reusable JSON contract templates to copy and edit.</w:t>
             </w:r>
           </w:p>
         </w:tc>
@@ -315,21 +286,28 @@
       <w:tr>
         <w:tc>
           <w:tcPr>
-            <w:tcW w:type="dxa" w:w="3744"/>
+            <w:tcW w:type="dxa" w:w="4320"/>
           </w:tcPr>
           <w:p>
             <w:r>
-              <w:t>DDSDDE line block</w:t>
+              <w:rPr>
+                <w:rFonts w:ascii="Consolas" w:hAnsi="Consolas"/>
+                <w:sz w:val="18"/>
+              </w:rPr>
+              <w:t>examples/</w:t>
             </w:r>
           </w:p>
         </w:tc>
         <w:tc>
           <w:tcPr>
-            <w:tcW w:type="dxa" w:w="5616"/>
+            <w:tcW w:type="dxa" w:w="4320"/>
           </w:tcPr>
           <w:p>
             <w:r>
-              <w:t>auto, from a scan of the source</w:t>
+              <w:rPr>
+                <w:sz w:val="20"/>
+              </w:rPr>
+              <w:t>Small worked example JSON contracts that already run.</w:t>
             </w:r>
           </w:p>
         </w:tc>
@@ -337,21 +315,416 @@
       <w:tr>
         <w:tc>
           <w:tcPr>
-            <w:tcW w:type="dxa" w:w="3744"/>
+            <w:tcW w:type="dxa" w:w="4320"/>
           </w:tcPr>
           <w:p>
             <w:r>
-              <w:t>Finite strain fix</w:t>
+              <w:rPr>
+                <w:rFonts w:ascii="Consolas" w:hAnsi="Consolas"/>
+                <w:sz w:val="18"/>
+              </w:rPr>
+              <w:t>user_jsons/</w:t>
             </w:r>
           </w:p>
         </w:tc>
         <w:tc>
           <w:tcPr>
-            <w:tcW w:type="dxa" w:w="5616"/>
+            <w:tcW w:type="dxa" w:w="4320"/>
           </w:tcPr>
           <w:p>
             <w:r>
-              <w:t>auto: the seed_dfgrd1 correction is applied when needed</w:t>
+              <w:rPr>
+                <w:sz w:val="20"/>
+              </w:rPr>
+              <w:t>Suggested location for your own JSON contracts.</w:t>
+            </w:r>
+          </w:p>
+        </w:tc>
+      </w:tr>
+      <w:tr>
+        <w:tc>
+          <w:tcPr>
+            <w:tcW w:type="dxa" w:w="4320"/>
+          </w:tcPr>
+          <w:p>
+            <w:r>
+              <w:rPr>
+                <w:rFonts w:ascii="Consolas" w:hAnsi="Consolas"/>
+                <w:sz w:val="18"/>
+              </w:rPr>
+              <w:t>json_files/</w:t>
+            </w:r>
+          </w:p>
+        </w:tc>
+        <w:tc>
+          <w:tcPr>
+            <w:tcW w:type="dxa" w:w="4320"/>
+          </w:tcPr>
+          <w:p>
+            <w:r>
+              <w:rPr>
+                <w:sz w:val="20"/>
+              </w:rPr>
+              <w:t>General directory for user-authored compact contracts.</w:t>
+            </w:r>
+          </w:p>
+        </w:tc>
+      </w:tr>
+      <w:tr>
+        <w:tc>
+          <w:tcPr>
+            <w:tcW w:type="dxa" w:w="4320"/>
+          </w:tcPr>
+          <w:p>
+            <w:r>
+              <w:rPr>
+                <w:rFonts w:ascii="Consolas" w:hAnsi="Consolas"/>
+                <w:sz w:val="18"/>
+              </w:rPr>
+              <w:t>json_files_completed/</w:t>
+            </w:r>
+          </w:p>
+        </w:tc>
+        <w:tc>
+          <w:tcPr>
+            <w:tcW w:type="dxa" w:w="4320"/>
+          </w:tcPr>
+          <w:p>
+            <w:r>
+              <w:rPr>
+                <w:sz w:val="20"/>
+              </w:rPr>
+              <w:t>The 19 completed benchmark contracts in the current format.</w:t>
+            </w:r>
+          </w:p>
+        </w:tc>
+      </w:tr>
+      <w:tr>
+        <w:tc>
+          <w:tcPr>
+            <w:tcW w:type="dxa" w:w="4320"/>
+          </w:tcPr>
+          <w:p>
+            <w:r>
+              <w:rPr>
+                <w:rFonts w:ascii="Consolas" w:hAnsi="Consolas"/>
+                <w:sz w:val="18"/>
+              </w:rPr>
+              <w:t>UMATs/</w:t>
+            </w:r>
+          </w:p>
+        </w:tc>
+        <w:tc>
+          <w:tcPr>
+            <w:tcW w:type="dxa" w:w="4320"/>
+          </w:tcPr>
+          <w:p>
+            <w:r>
+              <w:rPr>
+                <w:sz w:val="20"/>
+              </w:rPr>
+              <w:t>Bundled sample UMAT source files used by the example configs.</w:t>
+            </w:r>
+          </w:p>
+        </w:tc>
+      </w:tr>
+      <w:tr>
+        <w:tc>
+          <w:tcPr>
+            <w:tcW w:type="dxa" w:w="4320"/>
+          </w:tcPr>
+          <w:p>
+            <w:r>
+              <w:rPr>
+                <w:rFonts w:ascii="Consolas" w:hAnsi="Consolas"/>
+                <w:sz w:val="18"/>
+              </w:rPr>
+              <w:t>new_user_umat_starter/</w:t>
+            </w:r>
+          </w:p>
+        </w:tc>
+        <w:tc>
+          <w:tcPr>
+            <w:tcW w:type="dxa" w:w="4320"/>
+          </w:tcPr>
+          <w:p>
+            <w:r>
+              <w:rPr>
+                <w:sz w:val="20"/>
+              </w:rPr>
+              <w:t>Starter documentation and helper scripts.</w:t>
+            </w:r>
+          </w:p>
+        </w:tc>
+      </w:tr>
+      <w:tr>
+        <w:tc>
+          <w:tcPr>
+            <w:tcW w:type="dxa" w:w="4320"/>
+          </w:tcPr>
+          <w:p>
+            <w:r>
+              <w:rPr>
+                <w:rFonts w:ascii="Consolas" w:hAnsi="Consolas"/>
+                <w:sz w:val="18"/>
+              </w:rPr>
+              <w:t>tools/run_completed_json_batch.py</w:t>
+            </w:r>
+          </w:p>
+        </w:tc>
+        <w:tc>
+          <w:tcPr>
+            <w:tcW w:type="dxa" w:w="4320"/>
+          </w:tcPr>
+          <w:p>
+            <w:r>
+              <w:rPr>
+                <w:sz w:val="20"/>
+              </w:rPr>
+              <w:t>Batch transform runner for the completed set.</w:t>
+            </w:r>
+          </w:p>
+        </w:tc>
+      </w:tr>
+      <w:tr>
+        <w:tc>
+          <w:tcPr>
+            <w:tcW w:type="dxa" w:w="4320"/>
+          </w:tcPr>
+          <w:p>
+            <w:r>
+              <w:rPr>
+                <w:rFonts w:ascii="Consolas" w:hAnsi="Consolas"/>
+                <w:sz w:val="18"/>
+              </w:rPr>
+              <w:t>vendor/_otilib_upstream/</w:t>
+            </w:r>
+          </w:p>
+        </w:tc>
+        <w:tc>
+          <w:tcPr>
+            <w:tcW w:type="dxa" w:w="4320"/>
+          </w:tcPr>
+          <w:p>
+            <w:r>
+              <w:rPr>
+                <w:sz w:val="20"/>
+              </w:rPr>
+              <w:t>Bundled pyoti template files for OTI module generation.</w:t>
+            </w:r>
+          </w:p>
+        </w:tc>
+      </w:tr>
+      <w:tr>
+        <w:tc>
+          <w:tcPr>
+            <w:tcW w:type="dxa" w:w="4320"/>
+          </w:tcPr>
+          <w:p>
+            <w:r>
+              <w:rPr>
+                <w:rFonts w:ascii="Consolas" w:hAnsi="Consolas"/>
+                <w:sz w:val="18"/>
+              </w:rPr>
+              <w:t>run_json_pipeline.py</w:t>
+            </w:r>
+          </w:p>
+        </w:tc>
+        <w:tc>
+          <w:tcPr>
+            <w:tcW w:type="dxa" w:w="4320"/>
+          </w:tcPr>
+          <w:p>
+            <w:r>
+              <w:rPr>
+                <w:sz w:val="20"/>
+              </w:rPr>
+              <w:t>No-argument runner driven by settings at the top of the file.</w:t>
+            </w:r>
+          </w:p>
+        </w:tc>
+      </w:tr>
+      <w:tr>
+        <w:tc>
+          <w:tcPr>
+            <w:tcW w:type="dxa" w:w="4320"/>
+          </w:tcPr>
+          <w:p>
+            <w:r>
+              <w:rPr>
+                <w:rFonts w:ascii="Consolas" w:hAnsi="Consolas"/>
+                <w:sz w:val="18"/>
+              </w:rPr>
+              <w:t>transform_from_json.py</w:t>
+            </w:r>
+          </w:p>
+        </w:tc>
+        <w:tc>
+          <w:tcPr>
+            <w:tcW w:type="dxa" w:w="4320"/>
+          </w:tcPr>
+          <w:p>
+            <w:r>
+              <w:rPr>
+                <w:sz w:val="20"/>
+              </w:rPr>
+              <w:t>Single-contract command-line transform front door.</w:t>
+            </w:r>
+          </w:p>
+        </w:tc>
+      </w:tr>
+      <w:tr>
+        <w:tc>
+          <w:tcPr>
+            <w:tcW w:type="dxa" w:w="4320"/>
+          </w:tcPr>
+          <w:p>
+            <w:r>
+              <w:rPr>
+                <w:rFonts w:ascii="Consolas" w:hAnsi="Consolas"/>
+                <w:sz w:val="18"/>
+              </w:rPr>
+              <w:t>validate_all_local.py</w:t>
+            </w:r>
+          </w:p>
+        </w:tc>
+        <w:tc>
+          <w:tcPr>
+            <w:tcW w:type="dxa" w:w="4320"/>
+          </w:tcPr>
+          <w:p>
+            <w:r>
+              <w:rPr>
+                <w:sz w:val="20"/>
+              </w:rPr>
+              <w:t>Local validation helper across contracts.</w:t>
+            </w:r>
+          </w:p>
+        </w:tc>
+      </w:tr>
+      <w:tr>
+        <w:tc>
+          <w:tcPr>
+            <w:tcW w:type="dxa" w:w="4320"/>
+          </w:tcPr>
+          <w:p>
+            <w:r>
+              <w:rPr>
+                <w:rFonts w:ascii="Consolas" w:hAnsi="Consolas"/>
+                <w:sz w:val="18"/>
+              </w:rPr>
+              <w:t>verify_abaqus_local.py</w:t>
+            </w:r>
+          </w:p>
+        </w:tc>
+        <w:tc>
+          <w:tcPr>
+            <w:tcW w:type="dxa" w:w="4320"/>
+          </w:tcPr>
+          <w:p>
+            <w:r>
+              <w:rPr>
+                <w:sz w:val="20"/>
+              </w:rPr>
+              <w:t>Abaqus verification helper (requires Abaqus).</w:t>
+            </w:r>
+          </w:p>
+        </w:tc>
+      </w:tr>
+    </w:tbl>
+    <w:p/>
+    <w:p>
+      <w:pPr>
+        <w:pStyle w:val="Heading1"/>
+      </w:pPr>
+      <w:r>
+        <w:t>3. Requirements and Installation</w:t>
+      </w:r>
+    </w:p>
+    <w:p>
+      <w:pPr>
+        <w:pStyle w:val="Heading2"/>
+      </w:pPr>
+      <w:r>
+        <w:t>Requirements</w:t>
+      </w:r>
+    </w:p>
+    <w:p>
+      <w:pPr>
+        <w:pStyle w:val="ListBullet"/>
+      </w:pPr>
+      <w:r>
+        <w:t>Python 3.10 or newer (Python 3.12 recommended).</w:t>
+      </w:r>
+    </w:p>
+    <w:p>
+      <w:pPr>
+        <w:pStyle w:val="ListBullet"/>
+      </w:pPr>
+      <w:r>
+        <w:t>The Python dependencies are installed automatically with the package (numpy, sympy, and the GUI/reporting stack).</w:t>
+      </w:r>
+    </w:p>
+    <w:p>
+      <w:pPr>
+        <w:pStyle w:val="ListBullet"/>
+      </w:pPr>
+      <w:r>
+        <w:t>A Fortran compiler (for example gfortran) is only needed if you want to compile generated source locally.</w:t>
+      </w:r>
+    </w:p>
+    <w:p>
+      <w:pPr>
+        <w:pStyle w:val="ListBullet"/>
+      </w:pPr>
+      <w:r>
+        <w:t>Abaqus is only needed for the original-vs-transformed validation pipeline. The transformation itself does not require Abaqus.</w:t>
+      </w:r>
+    </w:p>
+    <w:p>
+      <w:pPr>
+        <w:pStyle w:val="Heading2"/>
+      </w:pPr>
+      <w:r>
+        <w:t>Install from source</w:t>
+      </w:r>
+    </w:p>
+    <w:p>
+      <w:r>
+        <w:t>From the top-level bundle directory:</w:t>
+      </w:r>
+    </w:p>
+    <w:tbl>
+      <w:tblPr>
+        <w:tblW w:type="auto" w:w="0"/>
+        <w:jc w:val="left"/>
+        <w:tblLook w:firstColumn="1" w:firstRow="1" w:lastColumn="0" w:lastRow="0" w:noHBand="0" w:noVBand="1" w:val="04A0"/>
+        <w:tblBorders>
+          <w:top w:val="single" w:sz="4" w:color="D0D0D0"/>
+          <w:left w:val="single" w:sz="4" w:color="D0D0D0"/>
+          <w:bottom w:val="single" w:sz="4" w:color="D0D0D0"/>
+          <w:right w:val="single" w:sz="4" w:color="D0D0D0"/>
+        </w:tblBorders>
+      </w:tblPr>
+      <w:tblGrid>
+        <w:gridCol w:w="8640"/>
+      </w:tblGrid>
+      <w:tr>
+        <w:tc>
+          <w:tcPr>
+            <w:tcW w:type="dxa" w:w="9072"/>
+            <w:shd w:val="clear" w:color="auto" w:fill="F2F2F2"/>
+          </w:tcPr>
+          <w:p>
+            <w:pPr>
+              <w:spacing w:before="40" w:after="40"/>
+            </w:pPr>
+            <w:r>
+              <w:rPr>
+                <w:rFonts w:ascii="Consolas" w:hAnsi="Consolas"/>
+                <w:sz w:val="18"/>
+              </w:rPr>
+              <w:t>python3 -m pip install -e .</w:t>
             </w:r>
           </w:p>
         </w:tc>
@@ -360,10 +733,67 @@
     <w:p/>
     <w:p>
       <w:r>
-        <w:rPr>
-          <w:b w:val="0"/>
-        </w:rPr>
-        <w:t>You can still override any field before pressing Transform, for example if your analysis uses a different number of directions than the source suggests.</w:t>
+        <w:t>On clusters where the default python is older than 3.10 (for example ARC), use /usr/bin/python3.12 in place of python3. You do not need to install the package just to run the bundled starter scripts; they work directly from the folder.</w:t>
+      </w:r>
+    </w:p>
+    <w:p>
+      <w:pPr>
+        <w:pStyle w:val="Heading2"/>
+      </w:pPr>
+      <w:r>
+        <w:t>Install test extras</w:t>
+      </w:r>
+    </w:p>
+    <w:tbl>
+      <w:tblPr>
+        <w:tblW w:type="auto" w:w="0"/>
+        <w:jc w:val="left"/>
+        <w:tblLook w:firstColumn="1" w:firstRow="1" w:lastColumn="0" w:lastRow="0" w:noHBand="0" w:noVBand="1" w:val="04A0"/>
+        <w:tblBorders>
+          <w:top w:val="single" w:sz="4" w:color="D0D0D0"/>
+          <w:left w:val="single" w:sz="4" w:color="D0D0D0"/>
+          <w:bottom w:val="single" w:sz="4" w:color="D0D0D0"/>
+          <w:right w:val="single" w:sz="4" w:color="D0D0D0"/>
+        </w:tblBorders>
+      </w:tblPr>
+      <w:tblGrid>
+        <w:gridCol w:w="8640"/>
+      </w:tblGrid>
+      <w:tr>
+        <w:tc>
+          <w:tcPr>
+            <w:tcW w:type="dxa" w:w="9072"/>
+            <w:shd w:val="clear" w:color="auto" w:fill="F2F2F2"/>
+          </w:tcPr>
+          <w:p>
+            <w:pPr>
+              <w:spacing w:before="40" w:after="40"/>
+            </w:pPr>
+            <w:r>
+              <w:rPr>
+                <w:rFonts w:ascii="Consolas" w:hAnsi="Consolas"/>
+                <w:sz w:val="18"/>
+              </w:rPr>
+              <w:t>python -m pip install -e ".[test]"</w:t>
+            </w:r>
+            <w:r>
+              <w:br/>
+            </w:r>
+            <w:r>
+              <w:rPr>
+                <w:rFonts w:ascii="Consolas" w:hAnsi="Consolas"/>
+                <w:sz w:val="18"/>
+              </w:rPr>
+              <w:t>python -m pytest</w:t>
+            </w:r>
+          </w:p>
+        </w:tc>
+      </w:tr>
+    </w:tbl>
+    <w:p/>
+    <w:p>
+      <w:r>
+        <w:t>The test suite requires neither Abaqus nor a Fortran compiler.</w:t>
       </w:r>
     </w:p>
     <w:p>
@@ -371,10 +801,12 @@
         <w:pStyle w:val="Heading1"/>
       </w:pPr>
       <w:r>
-        <w:rPr>
-          <w:color w:val="F15A22"/>
-        </w:rPr>
-        <w:t>5. Single file and multi file UMATs</w:t>
+        <w:t>4. The Compact JSON Contract</w:t>
+      </w:r>
+    </w:p>
+    <w:p>
+      <w:r>
+        <w:t>Every transformation is described by a single compact JSON file. Any variable you do not explicitly classify is classified automatically, so a minimal contract is short.</w:t>
       </w:r>
     </w:p>
     <w:p>
@@ -382,18 +814,307 @@
         <w:pStyle w:val="Heading2"/>
       </w:pPr>
       <w:r>
-        <w:rPr>
-          <w:color w:val="1F3864"/>
-        </w:rPr>
-        <w:t>Single file</w:t>
+        <w:t>Minimal shape</w:t>
+      </w:r>
+    </w:p>
+    <w:tbl>
+      <w:tblPr>
+        <w:tblW w:type="auto" w:w="0"/>
+        <w:jc w:val="left"/>
+        <w:tblLook w:firstColumn="1" w:firstRow="1" w:lastColumn="0" w:lastRow="0" w:noHBand="0" w:noVBand="1" w:val="04A0"/>
+        <w:tblBorders>
+          <w:top w:val="single" w:sz="4" w:color="D0D0D0"/>
+          <w:left w:val="single" w:sz="4" w:color="D0D0D0"/>
+          <w:bottom w:val="single" w:sz="4" w:color="D0D0D0"/>
+          <w:right w:val="single" w:sz="4" w:color="D0D0D0"/>
+        </w:tblBorders>
+      </w:tblPr>
+      <w:tblGrid>
+        <w:gridCol w:w="8640"/>
+      </w:tblGrid>
+      <w:tr>
+        <w:tc>
+          <w:tcPr>
+            <w:tcW w:type="dxa" w:w="9072"/>
+            <w:shd w:val="clear" w:color="auto" w:fill="F2F2F2"/>
+          </w:tcPr>
+          <w:p>
+            <w:pPr>
+              <w:spacing w:before="40" w:after="40"/>
+            </w:pPr>
+            <w:r>
+              <w:rPr>
+                <w:rFonts w:ascii="Consolas" w:hAnsi="Consolas"/>
+                <w:sz w:val="18"/>
+              </w:rPr>
+              <w:t>{</w:t>
+            </w:r>
+            <w:r>
+              <w:br/>
+            </w:r>
+            <w:r>
+              <w:rPr>
+                <w:rFonts w:ascii="Consolas" w:hAnsi="Consolas"/>
+                <w:sz w:val="18"/>
+              </w:rPr>
+              <w:t xml:space="preserve">  "name": "my_new_umat",</w:t>
+            </w:r>
+            <w:r>
+              <w:br/>
+            </w:r>
+            <w:r>
+              <w:rPr>
+                <w:rFonts w:ascii="Consolas" w:hAnsi="Consolas"/>
+                <w:sz w:val="18"/>
+              </w:rPr>
+              <w:t xml:space="preserve">  "source": "/absolute/path/to/your_umat.for",</w:t>
+            </w:r>
+            <w:r>
+              <w:br/>
+            </w:r>
+            <w:r>
+              <w:rPr>
+                <w:rFonts w:ascii="Consolas" w:hAnsi="Consolas"/>
+                <w:sz w:val="18"/>
+              </w:rPr>
+              <w:t xml:space="preserve">  "jacobian": {</w:t>
+            </w:r>
+            <w:r>
+              <w:br/>
+            </w:r>
+            <w:r>
+              <w:rPr>
+                <w:rFonts w:ascii="Consolas" w:hAnsi="Consolas"/>
+                <w:sz w:val="18"/>
+              </w:rPr>
+              <w:t xml:space="preserve">    "seed": "DSTRAN",</w:t>
+            </w:r>
+            <w:r>
+              <w:br/>
+            </w:r>
+            <w:r>
+              <w:rPr>
+                <w:rFonts w:ascii="Consolas" w:hAnsi="Consolas"/>
+                <w:sz w:val="18"/>
+              </w:rPr>
+              <w:t xml:space="preserve">    "output": "STRESS",</w:t>
+            </w:r>
+            <w:r>
+              <w:br/>
+            </w:r>
+            <w:r>
+              <w:rPr>
+                <w:rFonts w:ascii="Consolas" w:hAnsi="Consolas"/>
+                <w:sz w:val="18"/>
+              </w:rPr>
+              <w:t xml:space="preserve">    "target": "DDSDDE"</w:t>
+            </w:r>
+            <w:r>
+              <w:br/>
+            </w:r>
+            <w:r>
+              <w:rPr>
+                <w:rFonts w:ascii="Consolas" w:hAnsi="Consolas"/>
+                <w:sz w:val="18"/>
+              </w:rPr>
+              <w:t xml:space="preserve">  },</w:t>
+            </w:r>
+            <w:r>
+              <w:br/>
+            </w:r>
+            <w:r>
+              <w:rPr>
+                <w:rFonts w:ascii="Consolas" w:hAnsi="Consolas"/>
+                <w:sz w:val="18"/>
+              </w:rPr>
+              <w:t xml:space="preserve">  "promote": ["STRESS"],</w:t>
+            </w:r>
+            <w:r>
+              <w:br/>
+            </w:r>
+            <w:r>
+              <w:rPr>
+                <w:rFonts w:ascii="Consolas" w:hAnsi="Consolas"/>
+                <w:sz w:val="18"/>
+              </w:rPr>
+              <w:t xml:space="preserve">  "replace": ["120-132"],</w:t>
+            </w:r>
+            <w:r>
+              <w:br/>
+            </w:r>
+            <w:r>
+              <w:rPr>
+                <w:rFonts w:ascii="Consolas" w:hAnsi="Consolas"/>
+                <w:sz w:val="18"/>
+              </w:rPr>
+              <w:t xml:space="preserve">  "ntens": 6,</w:t>
+            </w:r>
+            <w:r>
+              <w:br/>
+            </w:r>
+            <w:r>
+              <w:rPr>
+                <w:rFonts w:ascii="Consolas" w:hAnsi="Consolas"/>
+                <w:sz w:val="18"/>
+              </w:rPr>
+              <w:t xml:space="preserve">  "order": 1</w:t>
+            </w:r>
+            <w:r>
+              <w:br/>
+            </w:r>
+            <w:r>
+              <w:rPr>
+                <w:rFonts w:ascii="Consolas" w:hAnsi="Consolas"/>
+                <w:sz w:val="18"/>
+              </w:rPr>
+              <w:t>}</w:t>
+            </w:r>
+          </w:p>
+        </w:tc>
+      </w:tr>
+    </w:tbl>
+    <w:p/>
+    <w:p>
+      <w:pPr>
+        <w:pStyle w:val="Heading2"/>
+      </w:pPr>
+      <w:r>
+        <w:t>Required fields</w:t>
       </w:r>
     </w:p>
     <w:p>
+      <w:pPr>
+        <w:pStyle w:val="ListBullet"/>
+      </w:pPr>
       <w:r>
         <w:rPr>
-          <w:b w:val="0"/>
+          <w:rFonts w:ascii="Consolas" w:hAnsi="Consolas"/>
+          <w:b/>
         </w:rPr>
-        <w:t>Paste the file and press Transform. The tool builds the contract from a scan and runs the original pipeline. This path is verified in Abaqus and is the most robust.</w:t>
+        <w:t>name</w:t>
+      </w:r>
+      <w:r>
+        <w:t xml:space="preserve"> — Case label used in reports and output directory names.</w:t>
+      </w:r>
+    </w:p>
+    <w:p>
+      <w:pPr>
+        <w:pStyle w:val="ListBullet"/>
+      </w:pPr>
+      <w:r>
+        <w:rPr>
+          <w:rFonts w:ascii="Consolas" w:hAnsi="Consolas"/>
+          <w:b/>
+        </w:rPr>
+        <w:t>source</w:t>
+      </w:r>
+      <w:r>
+        <w:t xml:space="preserve"> — Path to the UMAT source file. Absolute paths are recommended. Relative paths resolve relative to the JSON file when it is loaded from disk.</w:t>
+      </w:r>
+    </w:p>
+    <w:p>
+      <w:pPr>
+        <w:pStyle w:val="ListBullet"/>
+      </w:pPr>
+      <w:r>
+        <w:rPr>
+          <w:rFonts w:ascii="Consolas" w:hAnsi="Consolas"/>
+          <w:b/>
+        </w:rPr>
+        <w:t>jacobian.seed</w:t>
+      </w:r>
+      <w:r>
+        <w:t xml:space="preserve"> — Independent variable seeded with OTI directions. For the standard UMAT tangent this is normally DSTRAN.</w:t>
+      </w:r>
+    </w:p>
+    <w:p>
+      <w:pPr>
+        <w:pStyle w:val="ListBullet"/>
+      </w:pPr>
+      <w:r>
+        <w:rPr>
+          <w:rFonts w:ascii="Consolas" w:hAnsi="Consolas"/>
+          <w:b/>
+        </w:rPr>
+        <w:t>jacobian.output</w:t>
+      </w:r>
+      <w:r>
+        <w:t xml:space="preserve"> — Output variable whose derivatives are extracted. Normally STRESS.</w:t>
+      </w:r>
+    </w:p>
+    <w:p>
+      <w:pPr>
+        <w:pStyle w:val="ListBullet"/>
+      </w:pPr>
+      <w:r>
+        <w:rPr>
+          <w:rFonts w:ascii="Consolas" w:hAnsi="Consolas"/>
+          <w:b/>
+        </w:rPr>
+        <w:t>jacobian.target</w:t>
+      </w:r>
+      <w:r>
+        <w:t xml:space="preserve"> — Real target array that receives the extracted derivatives. Normally DDSDDE.</w:t>
+      </w:r>
+    </w:p>
+    <w:p>
+      <w:pPr>
+        <w:pStyle w:val="ListBullet"/>
+      </w:pPr>
+      <w:r>
+        <w:rPr>
+          <w:rFonts w:ascii="Consolas" w:hAnsi="Consolas"/>
+          <w:b/>
+        </w:rPr>
+        <w:t>promote</w:t>
+      </w:r>
+      <w:r>
+        <w:t xml:space="preserve"> — Variables promoted to OTI values, usually the evolving stress-update quantities.</w:t>
+      </w:r>
+    </w:p>
+    <w:p>
+      <w:pPr>
+        <w:pStyle w:val="ListBullet"/>
+      </w:pPr>
+      <w:r>
+        <w:rPr>
+          <w:rFonts w:ascii="Consolas" w:hAnsi="Consolas"/>
+          <w:b/>
+        </w:rPr>
+        <w:t>replace</w:t>
+      </w:r>
+      <w:r>
+        <w:t xml:space="preserve"> — Inclusive 1-based line ranges for the old DDSDDE block to replace, e.g. "83-87". Use show_source_lines.py to find them.</w:t>
+      </w:r>
+    </w:p>
+    <w:p>
+      <w:pPr>
+        <w:pStyle w:val="ListBullet"/>
+      </w:pPr>
+      <w:r>
+        <w:rPr>
+          <w:rFonts w:ascii="Consolas" w:hAnsi="Consolas"/>
+          <w:b/>
+        </w:rPr>
+        <w:t>ntens</w:t>
+      </w:r>
+      <w:r>
+        <w:t xml:space="preserve"> — Tangent size used for DSTRAN(1:NTENS) seeding. Typically 4 for plane problems and 6 for 3D.</w:t>
+      </w:r>
+    </w:p>
+    <w:p>
+      <w:pPr>
+        <w:pStyle w:val="ListBullet"/>
+      </w:pPr>
+      <w:r>
+        <w:rPr>
+          <w:rFonts w:ascii="Consolas" w:hAnsi="Consolas"/>
+          <w:b/>
+        </w:rPr>
+        <w:t>order</w:t>
+      </w:r>
+      <w:r>
+        <w:t xml:space="preserve"> — OTI order. The current workflow is first-order, so this is normally 1.</w:t>
       </w:r>
     </w:p>
     <w:p>
@@ -401,26 +1122,789 @@
         <w:pStyle w:val="Heading2"/>
       </w:pPr>
       <w:r>
+        <w:t>Optional fields</w:t>
+      </w:r>
+    </w:p>
+    <w:p>
+      <w:pPr>
+        <w:pStyle w:val="ListBullet"/>
+      </w:pPr>
+      <w:r>
         <w:rPr>
-          <w:color w:val="1F3864"/>
+          <w:rFonts w:ascii="Consolas" w:hAnsi="Consolas"/>
+          <w:b/>
         </w:rPr>
-        <w:t>Multi file</w:t>
+        <w:t>constant</w:t>
+      </w:r>
+      <w:r>
+        <w:t xml:space="preserve"> — Variables that stay constant during differentiation (material properties, fixed inputs). Override only; classified automatically otherwise.</w:t>
+      </w:r>
+    </w:p>
+    <w:p>
+      <w:pPr>
+        <w:pStyle w:val="ListBullet"/>
+      </w:pPr>
+      <w:r>
+        <w:rPr>
+          <w:rFonts w:ascii="Consolas" w:hAnsi="Consolas"/>
+          <w:b/>
+        </w:rPr>
+        <w:t>real</w:t>
+      </w:r>
+      <w:r>
+        <w:t xml:space="preserve"> — Variables that must stay real, not OTI (e.g. DDSDDE, integer indices, loop counters). Inferred automatically when omitted. In code generation constant and real behave the same; the distinction is documentation.</w:t>
+      </w:r>
+    </w:p>
+    <w:p>
+      <w:pPr>
+        <w:pStyle w:val="ListBullet"/>
+      </w:pPr>
+      <w:r>
+        <w:rPr>
+          <w:rFonts w:ascii="Consolas" w:hAnsi="Consolas"/>
+          <w:b/>
+        </w:rPr>
+        <w:t>description</w:t>
+      </w:r>
+      <w:r>
+        <w:t xml:space="preserve"> — Free-text case description.</w:t>
+      </w:r>
+    </w:p>
+    <w:p>
+      <w:pPr>
+        <w:pStyle w:val="ListBullet"/>
+      </w:pPr>
+      <w:r>
+        <w:rPr>
+          <w:rFonts w:ascii="Consolas" w:hAnsi="Consolas"/>
+          <w:b/>
+        </w:rPr>
+        <w:t>umat</w:t>
+      </w:r>
+      <w:r>
+        <w:t xml:space="preserve"> — Entry routine name when the main routine is not the default detected UMAT.</w:t>
+      </w:r>
+    </w:p>
+    <w:p>
+      <w:pPr>
+        <w:pStyle w:val="ListBullet"/>
+      </w:pPr>
+      <w:r>
+        <w:rPr>
+          <w:rFonts w:ascii="Consolas" w:hAnsi="Consolas"/>
+          <w:b/>
+        </w:rPr>
+        <w:t>validation</w:t>
+      </w:r>
+      <w:r>
+        <w:t xml:space="preserve"> — Overrides for validation settings, e.g. compare lists and tolerances.</w:t>
       </w:r>
     </w:p>
     <w:p>
       <w:r>
-        <w:rPr>
-          <w:b w:val="0"/>
-        </w:rPr>
-        <w:t>Upload the head file, the one with SUBROUTINE UMAT, in the source box, and upload every file it depends on in the dependency files box. This includes shared utility modules that live outside the model folder. The tool then follows the USE statements, keeps the code the UMAT reaches, converts it to OTI, detects the seed, and writes one combined file.</w:t>
+        <w:t>Example validation block:</w:t>
+      </w:r>
+    </w:p>
+    <w:tbl>
+      <w:tblPr>
+        <w:tblW w:type="auto" w:w="0"/>
+        <w:jc w:val="left"/>
+        <w:tblLook w:firstColumn="1" w:firstRow="1" w:lastColumn="0" w:lastRow="0" w:noHBand="0" w:noVBand="1" w:val="04A0"/>
+        <w:tblBorders>
+          <w:top w:val="single" w:sz="4" w:color="D0D0D0"/>
+          <w:left w:val="single" w:sz="4" w:color="D0D0D0"/>
+          <w:bottom w:val="single" w:sz="4" w:color="D0D0D0"/>
+          <w:right w:val="single" w:sz="4" w:color="D0D0D0"/>
+        </w:tblBorders>
+      </w:tblPr>
+      <w:tblGrid>
+        <w:gridCol w:w="8640"/>
+      </w:tblGrid>
+      <w:tr>
+        <w:tc>
+          <w:tcPr>
+            <w:tcW w:type="dxa" w:w="9072"/>
+            <w:shd w:val="clear" w:color="auto" w:fill="F2F2F2"/>
+          </w:tcPr>
+          <w:p>
+            <w:pPr>
+              <w:spacing w:before="40" w:after="40"/>
+            </w:pPr>
+            <w:r>
+              <w:rPr>
+                <w:rFonts w:ascii="Consolas" w:hAnsi="Consolas"/>
+                <w:sz w:val="18"/>
+              </w:rPr>
+              <w:t>{</w:t>
+            </w:r>
+            <w:r>
+              <w:br/>
+            </w:r>
+            <w:r>
+              <w:rPr>
+                <w:rFonts w:ascii="Consolas" w:hAnsi="Consolas"/>
+                <w:sz w:val="18"/>
+              </w:rPr>
+              <w:t xml:space="preserve">  "validation": {</w:t>
+            </w:r>
+            <w:r>
+              <w:br/>
+            </w:r>
+            <w:r>
+              <w:rPr>
+                <w:rFonts w:ascii="Consolas" w:hAnsi="Consolas"/>
+                <w:sz w:val="18"/>
+              </w:rPr>
+              <w:t xml:space="preserve">    "compare": ["STRESS", "STATEV", "CONVERGENCE"],</w:t>
+            </w:r>
+            <w:r>
+              <w:br/>
+            </w:r>
+            <w:r>
+              <w:rPr>
+                <w:rFonts w:ascii="Consolas" w:hAnsi="Consolas"/>
+                <w:sz w:val="18"/>
+              </w:rPr>
+              <w:t xml:space="preserve">    "absolute_tolerance": 0.0001</w:t>
+            </w:r>
+            <w:r>
+              <w:br/>
+            </w:r>
+            <w:r>
+              <w:rPr>
+                <w:rFonts w:ascii="Consolas" w:hAnsi="Consolas"/>
+                <w:sz w:val="18"/>
+              </w:rPr>
+              <w:t xml:space="preserve">  }</w:t>
+            </w:r>
+            <w:r>
+              <w:br/>
+            </w:r>
+            <w:r>
+              <w:rPr>
+                <w:rFonts w:ascii="Consolas" w:hAnsi="Consolas"/>
+                <w:sz w:val="18"/>
+              </w:rPr>
+              <w:t>}</w:t>
+            </w:r>
+          </w:p>
+        </w:tc>
+      </w:tr>
+    </w:tbl>
+    <w:p/>
+    <w:p>
+      <w:pPr>
+        <w:pStyle w:val="Heading2"/>
+      </w:pPr>
+      <w:r>
+        <w:t>Variable-role rules</w:t>
+      </w:r>
+    </w:p>
+    <w:p>
+      <w:pPr>
+        <w:pStyle w:val="ListBullet"/>
+      </w:pPr>
+      <w:r>
+        <w:t>promote, constant, and real must be disjoint; a variable in more than one list will fail config loading.</w:t>
+      </w:r>
+    </w:p>
+    <w:p>
+      <w:pPr>
+        <w:pStyle w:val="ListBullet"/>
+      </w:pPr>
+      <w:r>
+        <w:t>Use uppercase names to match the scanner output and the rest of the repository.</w:t>
+      </w:r>
+    </w:p>
+    <w:p>
+      <w:pPr>
+        <w:pStyle w:val="Heading2"/>
+      </w:pPr>
+      <w:r>
+        <w:t>Advanced fields</w:t>
       </w:r>
     </w:p>
     <w:p>
       <w:r>
+        <w:t>These are only needed for advanced cases that lift helper-level constitutive outputs beyond the main DDSDDE path. Keep the base tangent contract working first.</w:t>
+      </w:r>
+    </w:p>
+    <w:p>
+      <w:pPr>
+        <w:pStyle w:val="ListBullet"/>
+      </w:pPr>
+      <w:r>
         <w:rPr>
-          <w:b w:val="0"/>
+          <w:rFonts w:ascii="Consolas" w:hAnsi="Consolas"/>
+          <w:b/>
         </w:rPr>
-        <w:t>If a multi file transform reports that it cannot open a module, the fix is to add that module file to the dependency uploads. The tool cannot invent a file it was not given.</w:t>
+        <w:t>constitutive_jacobians</w:t>
+      </w:r>
+      <w:r>
+        <w:t xml:space="preserve"> — extra constitutive Jacobian extraction contracts.</w:t>
+      </w:r>
+    </w:p>
+    <w:tbl>
+      <w:tblPr>
+        <w:tblW w:type="auto" w:w="0"/>
+        <w:jc w:val="left"/>
+        <w:tblLook w:firstColumn="1" w:firstRow="1" w:lastColumn="0" w:lastRow="0" w:noHBand="0" w:noVBand="1" w:val="04A0"/>
+        <w:tblBorders>
+          <w:top w:val="single" w:sz="4" w:color="D0D0D0"/>
+          <w:left w:val="single" w:sz="4" w:color="D0D0D0"/>
+          <w:bottom w:val="single" w:sz="4" w:color="D0D0D0"/>
+          <w:right w:val="single" w:sz="4" w:color="D0D0D0"/>
+        </w:tblBorders>
+      </w:tblPr>
+      <w:tblGrid>
+        <w:gridCol w:w="8640"/>
+      </w:tblGrid>
+      <w:tr>
+        <w:tc>
+          <w:tcPr>
+            <w:tcW w:type="dxa" w:w="9072"/>
+            <w:shd w:val="clear" w:color="auto" w:fill="F2F2F2"/>
+          </w:tcPr>
+          <w:p>
+            <w:pPr>
+              <w:spacing w:before="40" w:after="40"/>
+            </w:pPr>
+            <w:r>
+              <w:rPr>
+                <w:rFonts w:ascii="Consolas" w:hAnsi="Consolas"/>
+                <w:sz w:val="18"/>
+              </w:rPr>
+              <w:t>{</w:t>
+            </w:r>
+            <w:r>
+              <w:br/>
+            </w:r>
+            <w:r>
+              <w:rPr>
+                <w:rFonts w:ascii="Consolas" w:hAnsi="Consolas"/>
+                <w:sz w:val="18"/>
+              </w:rPr>
+              <w:t xml:space="preserve">  "constitutive_jacobians": [</w:t>
+            </w:r>
+            <w:r>
+              <w:br/>
+            </w:r>
+            <w:r>
+              <w:rPr>
+                <w:rFonts w:ascii="Consolas" w:hAnsi="Consolas"/>
+                <w:sz w:val="18"/>
+              </w:rPr>
+              <w:t xml:space="preserve">    {</w:t>
+            </w:r>
+            <w:r>
+              <w:br/>
+            </w:r>
+            <w:r>
+              <w:rPr>
+                <w:rFonts w:ascii="Consolas" w:hAnsi="Consolas"/>
+                <w:sz w:val="18"/>
+              </w:rPr>
+              <w:t xml:space="preserve">      "id": "fjac_from_oti",</w:t>
+            </w:r>
+            <w:r>
+              <w:br/>
+            </w:r>
+            <w:r>
+              <w:rPr>
+                <w:rFonts w:ascii="Consolas" w:hAnsi="Consolas"/>
+                <w:sz w:val="18"/>
+              </w:rPr>
+              <w:t xml:space="preserve">      "description": "Example constitutive Jacobian contract.",</w:t>
+            </w:r>
+            <w:r>
+              <w:br/>
+            </w:r>
+            <w:r>
+              <w:rPr>
+                <w:rFonts w:ascii="Consolas" w:hAnsi="Consolas"/>
+                <w:sz w:val="18"/>
+              </w:rPr>
+              <w:t xml:space="preserve">      "seed": "G1",</w:t>
+            </w:r>
+            <w:r>
+              <w:br/>
+            </w:r>
+            <w:r>
+              <w:rPr>
+                <w:rFonts w:ascii="Consolas" w:hAnsi="Consolas"/>
+                <w:sz w:val="18"/>
+              </w:rPr>
+              <w:t xml:space="preserve">      "seed_shape": "scalar",</w:t>
+            </w:r>
+            <w:r>
+              <w:br/>
+            </w:r>
+            <w:r>
+              <w:rPr>
+                <w:rFonts w:ascii="Consolas" w:hAnsi="Consolas"/>
+                <w:sz w:val="18"/>
+              </w:rPr>
+              <w:t xml:space="preserve">      "seed_directions": 1,</w:t>
+            </w:r>
+            <w:r>
+              <w:br/>
+            </w:r>
+            <w:r>
+              <w:rPr>
+                <w:rFonts w:ascii="Consolas" w:hAnsi="Consolas"/>
+                <w:sz w:val="18"/>
+              </w:rPr>
+              <w:t xml:space="preserve">      "output": "G1JAC",</w:t>
+            </w:r>
+            <w:r>
+              <w:br/>
+            </w:r>
+            <w:r>
+              <w:rPr>
+                <w:rFonts w:ascii="Consolas" w:hAnsi="Consolas"/>
+                <w:sz w:val="18"/>
+              </w:rPr>
+              <w:t xml:space="preserve">      "output_shape": "scalar",</w:t>
+            </w:r>
+            <w:r>
+              <w:br/>
+            </w:r>
+            <w:r>
+              <w:rPr>
+                <w:rFonts w:ascii="Consolas" w:hAnsi="Consolas"/>
+                <w:sz w:val="18"/>
+              </w:rPr>
+              <w:t xml:space="preserve">      "loop": { "top": 250, "reseed_after": 260 },</w:t>
+            </w:r>
+            <w:r>
+              <w:br/>
+            </w:r>
+            <w:r>
+              <w:rPr>
+                <w:rFonts w:ascii="Consolas" w:hAnsi="Consolas"/>
+                <w:sz w:val="18"/>
+              </w:rPr>
+              <w:t xml:space="preserve">      "extract_after": 265,</w:t>
+            </w:r>
+            <w:r>
+              <w:br/>
+            </w:r>
+            <w:r>
+              <w:rPr>
+                <w:rFonts w:ascii="Consolas" w:hAnsi="Consolas"/>
+                <w:sz w:val="18"/>
+              </w:rPr>
+              <w:t xml:space="preserve">      "replace_variable": "G1JAC"</w:t>
+            </w:r>
+            <w:r>
+              <w:br/>
+            </w:r>
+            <w:r>
+              <w:rPr>
+                <w:rFonts w:ascii="Consolas" w:hAnsi="Consolas"/>
+                <w:sz w:val="18"/>
+              </w:rPr>
+              <w:t xml:space="preserve">    }</w:t>
+            </w:r>
+            <w:r>
+              <w:br/>
+            </w:r>
+            <w:r>
+              <w:rPr>
+                <w:rFonts w:ascii="Consolas" w:hAnsi="Consolas"/>
+                <w:sz w:val="18"/>
+              </w:rPr>
+              <w:t xml:space="preserve">  ]</w:t>
+            </w:r>
+            <w:r>
+              <w:br/>
+            </w:r>
+            <w:r>
+              <w:rPr>
+                <w:rFonts w:ascii="Consolas" w:hAnsi="Consolas"/>
+                <w:sz w:val="18"/>
+              </w:rPr>
+              <w:t>}</w:t>
+            </w:r>
+          </w:p>
+        </w:tc>
+      </w:tr>
+    </w:tbl>
+    <w:p/>
+    <w:p>
+      <w:pPr>
+        <w:pStyle w:val="ListBullet"/>
+      </w:pPr>
+      <w:r>
+        <w:rPr>
+          <w:rFonts w:ascii="Consolas" w:hAnsi="Consolas"/>
+          <w:b/>
+        </w:rPr>
+        <w:t>helper_surfaces</w:t>
+      </w:r>
+      <w:r>
+        <w:t xml:space="preserve"> — mappings from helper-local outputs back into caller variables.</w:t>
+      </w:r>
+    </w:p>
+    <w:tbl>
+      <w:tblPr>
+        <w:tblW w:type="auto" w:w="0"/>
+        <w:jc w:val="left"/>
+        <w:tblLook w:firstColumn="1" w:firstRow="1" w:lastColumn="0" w:lastRow="0" w:noHBand="0" w:noVBand="1" w:val="04A0"/>
+        <w:tblBorders>
+          <w:top w:val="single" w:sz="4" w:color="D0D0D0"/>
+          <w:left w:val="single" w:sz="4" w:color="D0D0D0"/>
+          <w:bottom w:val="single" w:sz="4" w:color="D0D0D0"/>
+          <w:right w:val="single" w:sz="4" w:color="D0D0D0"/>
+        </w:tblBorders>
+      </w:tblPr>
+      <w:tblGrid>
+        <w:gridCol w:w="8640"/>
+      </w:tblGrid>
+      <w:tr>
+        <w:tc>
+          <w:tcPr>
+            <w:tcW w:type="dxa" w:w="9072"/>
+            <w:shd w:val="clear" w:color="auto" w:fill="F2F2F2"/>
+          </w:tcPr>
+          <w:p>
+            <w:pPr>
+              <w:spacing w:before="40" w:after="40"/>
+            </w:pPr>
+            <w:r>
+              <w:rPr>
+                <w:rFonts w:ascii="Consolas" w:hAnsi="Consolas"/>
+                <w:sz w:val="18"/>
+              </w:rPr>
+              <w:t>{</w:t>
+            </w:r>
+            <w:r>
+              <w:br/>
+            </w:r>
+            <w:r>
+              <w:rPr>
+                <w:rFonts w:ascii="Consolas" w:hAnsi="Consolas"/>
+                <w:sz w:val="18"/>
+              </w:rPr>
+              <w:t xml:space="preserve">  "helper_surfaces": [</w:t>
+            </w:r>
+            <w:r>
+              <w:br/>
+            </w:r>
+            <w:r>
+              <w:rPr>
+                <w:rFonts w:ascii="Consolas" w:hAnsi="Consolas"/>
+                <w:sz w:val="18"/>
+              </w:rPr>
+              <w:t xml:space="preserve">    { "helper": "KCONSTITU", "target": "G1JAC", "source": "G1" }</w:t>
+            </w:r>
+            <w:r>
+              <w:br/>
+            </w:r>
+            <w:r>
+              <w:rPr>
+                <w:rFonts w:ascii="Consolas" w:hAnsi="Consolas"/>
+                <w:sz w:val="18"/>
+              </w:rPr>
+              <w:t xml:space="preserve">  ]</w:t>
+            </w:r>
+            <w:r>
+              <w:br/>
+            </w:r>
+            <w:r>
+              <w:rPr>
+                <w:rFonts w:ascii="Consolas" w:hAnsi="Consolas"/>
+                <w:sz w:val="18"/>
+              </w:rPr>
+              <w:t>}</w:t>
+            </w:r>
+          </w:p>
+        </w:tc>
+      </w:tr>
+    </w:tbl>
+    <w:p/>
+    <w:p>
+      <w:pPr>
+        <w:pStyle w:val="Heading1"/>
+      </w:pPr>
+      <w:r>
+        <w:t>5. Command-Line Tools and Scripts</w:t>
+      </w:r>
+    </w:p>
+    <w:p>
+      <w:pPr>
+        <w:pStyle w:val="Heading2"/>
+      </w:pPr>
+      <w:r>
+        <w:t>Installed entry points</w:t>
+      </w:r>
+    </w:p>
+    <w:p>
+      <w:r>
+        <w:t>After pip install, three console commands are available:</w:t>
+      </w:r>
+    </w:p>
+    <w:tbl>
+      <w:tblPr>
+        <w:tblW w:type="auto" w:w="0"/>
+        <w:jc w:val="left"/>
+        <w:tblLook w:firstColumn="1" w:firstRow="1" w:lastColumn="0" w:lastRow="0" w:noHBand="0" w:noVBand="1" w:val="04A0"/>
+        <w:tblBorders>
+          <w:top w:val="single" w:sz="4" w:color="D0D0D0"/>
+          <w:left w:val="single" w:sz="4" w:color="D0D0D0"/>
+          <w:bottom w:val="single" w:sz="4" w:color="D0D0D0"/>
+          <w:right w:val="single" w:sz="4" w:color="D0D0D0"/>
+        </w:tblBorders>
+      </w:tblPr>
+      <w:tblGrid>
+        <w:gridCol w:w="8640"/>
+      </w:tblGrid>
+      <w:tr>
+        <w:tc>
+          <w:tcPr>
+            <w:tcW w:type="dxa" w:w="9072"/>
+            <w:shd w:val="clear" w:color="auto" w:fill="F2F2F2"/>
+          </w:tcPr>
+          <w:p>
+            <w:pPr>
+              <w:spacing w:before="40" w:after="40"/>
+            </w:pPr>
+            <w:r>
+              <w:rPr>
+                <w:rFonts w:ascii="Consolas" w:hAnsi="Consolas"/>
+                <w:sz w:val="18"/>
+              </w:rPr>
+              <w:t>umat-oti transform path/to/umat.for --out generated/case_name</w:t>
+            </w:r>
+            <w:r>
+              <w:br/>
+            </w:r>
+            <w:r>
+              <w:rPr>
+                <w:rFonts w:ascii="Consolas" w:hAnsi="Consolas"/>
+                <w:sz w:val="18"/>
+              </w:rPr>
+              <w:t>umat-oti-config --config json_files/my_new_umat.json --out umat_oti_workspace/my_new_umat</w:t>
+            </w:r>
+            <w:r>
+              <w:br/>
+            </w:r>
+            <w:r>
+              <w:rPr>
+                <w:rFonts w:ascii="Consolas" w:hAnsi="Consolas"/>
+                <w:sz w:val="18"/>
+              </w:rPr>
+              <w:t>umat-oti-batch --config-dir json_files_completed --batch-dir umat_oti_workspace/completed_json_batch</w:t>
+            </w:r>
+          </w:p>
+        </w:tc>
+      </w:tr>
+    </w:tbl>
+    <w:p/>
+    <w:p>
+      <w:pPr>
+        <w:pStyle w:val="ListBullet"/>
+      </w:pPr>
+      <w:r>
+        <w:t>umat-oti — direct source transform of a single UMAT file.</w:t>
+      </w:r>
+    </w:p>
+    <w:p>
+      <w:pPr>
+        <w:pStyle w:val="ListBullet"/>
+      </w:pPr>
+      <w:r>
+        <w:t>umat-oti-config — transform driven by a compact JSON contract.</w:t>
+      </w:r>
+    </w:p>
+    <w:p>
+      <w:pPr>
+        <w:pStyle w:val="ListBullet"/>
+      </w:pPr>
+      <w:r>
+        <w:t>umat-oti-batch — transform every contract in a directory.</w:t>
+      </w:r>
+    </w:p>
+    <w:p>
+      <w:r>
+        <w:t>Without installation, the same JSON path is:</w:t>
+      </w:r>
+    </w:p>
+    <w:tbl>
+      <w:tblPr>
+        <w:tblW w:type="auto" w:w="0"/>
+        <w:jc w:val="left"/>
+        <w:tblLook w:firstColumn="1" w:firstRow="1" w:lastColumn="0" w:lastRow="0" w:noHBand="0" w:noVBand="1" w:val="04A0"/>
+        <w:tblBorders>
+          <w:top w:val="single" w:sz="4" w:color="D0D0D0"/>
+          <w:left w:val="single" w:sz="4" w:color="D0D0D0"/>
+          <w:bottom w:val="single" w:sz="4" w:color="D0D0D0"/>
+          <w:right w:val="single" w:sz="4" w:color="D0D0D0"/>
+        </w:tblBorders>
+      </w:tblPr>
+      <w:tblGrid>
+        <w:gridCol w:w="8640"/>
+      </w:tblGrid>
+      <w:tr>
+        <w:tc>
+          <w:tcPr>
+            <w:tcW w:type="dxa" w:w="9072"/>
+            <w:shd w:val="clear" w:color="auto" w:fill="F2F2F2"/>
+          </w:tcPr>
+          <w:p>
+            <w:pPr>
+              <w:spacing w:before="40" w:after="40"/>
+            </w:pPr>
+            <w:r>
+              <w:rPr>
+                <w:rFonts w:ascii="Consolas" w:hAnsi="Consolas"/>
+                <w:sz w:val="18"/>
+              </w:rPr>
+              <w:t>PYTHONPATH=src python3 -m umat_oti.cli_json --config json_files/my_new_umat.json --out umat_oti_workspace/my_new_umat</w:t>
+            </w:r>
+          </w:p>
+        </w:tc>
+      </w:tr>
+    </w:tbl>
+    <w:p/>
+    <w:p>
+      <w:pPr>
+        <w:pStyle w:val="Heading2"/>
+      </w:pPr>
+      <w:r>
+        <w:t>Top-level scripts</w:t>
+      </w:r>
+    </w:p>
+    <w:p>
+      <w:pPr>
+        <w:pStyle w:val="ListBullet"/>
+      </w:pPr>
+      <w:r>
+        <w:rPr>
+          <w:rFonts w:ascii="Consolas" w:hAnsi="Consolas"/>
+          <w:b/>
+        </w:rPr>
+        <w:t>run_json_pipeline.py</w:t>
+      </w:r>
+      <w:r>
+        <w:t xml:space="preserve"> — No-argument runner. Edit JSON_INPUT_PATH and OUTPUT_DIRECTORY at the top of the file, then run it. Defaults to examples/ and to RUN_VALIDATION = False so it works without Abaqus.</w:t>
+      </w:r>
+    </w:p>
+    <w:p>
+      <w:pPr>
+        <w:pStyle w:val="ListBullet"/>
+      </w:pPr>
+      <w:r>
+        <w:rPr>
+          <w:rFonts w:ascii="Consolas" w:hAnsi="Consolas"/>
+          <w:b/>
+        </w:rPr>
+        <w:t>transform_from_json.py</w:t>
+      </w:r>
+      <w:r>
+        <w:t xml:space="preserve"> — Shortest single-contract command-line front door: transform_from_json.py &lt;config.json&gt; --out &lt;dir&gt;.</w:t>
+      </w:r>
+    </w:p>
+    <w:p>
+      <w:pPr>
+        <w:pStyle w:val="ListBullet"/>
+      </w:pPr>
+      <w:r>
+        <w:rPr>
+          <w:rFonts w:ascii="Consolas" w:hAnsi="Consolas"/>
+          <w:b/>
+        </w:rPr>
+        <w:t>validate_all_local.py</w:t>
+      </w:r>
+      <w:r>
+        <w:t xml:space="preserve"> — Runs local checks across contracts without Abaqus.</w:t>
+      </w:r>
+    </w:p>
+    <w:p>
+      <w:pPr>
+        <w:pStyle w:val="ListBullet"/>
+      </w:pPr>
+      <w:r>
+        <w:rPr>
+          <w:rFonts w:ascii="Consolas" w:hAnsi="Consolas"/>
+          <w:b/>
+        </w:rPr>
+        <w:t>verify_abaqus_local.py</w:t>
+      </w:r>
+      <w:r>
+        <w:t xml:space="preserve"> — Runs Abaqus verification locally (requires an Abaqus installation).</w:t>
+      </w:r>
+    </w:p>
+    <w:p>
+      <w:pPr>
+        <w:pStyle w:val="Heading2"/>
+      </w:pPr>
+      <w:r>
+        <w:t>Starter helper scripts</w:t>
+      </w:r>
+    </w:p>
+    <w:p>
+      <w:pPr>
+        <w:pStyle w:val="ListBullet"/>
+      </w:pPr>
+      <w:r>
+        <w:rPr>
+          <w:rFonts w:ascii="Consolas" w:hAnsi="Consolas"/>
+          <w:b/>
+          <w:sz w:val="18"/>
+        </w:rPr>
+        <w:t>new_user_umat_starter/scripts/scan_source.py</w:t>
+      </w:r>
+      <w:r>
+        <w:t xml:space="preserve"> — Prints detected UMAT routines, candidate regions, and a compact source summary.</w:t>
+      </w:r>
+    </w:p>
+    <w:p>
+      <w:pPr>
+        <w:pStyle w:val="ListBullet"/>
+      </w:pPr>
+      <w:r>
+        <w:rPr>
+          <w:rFonts w:ascii="Consolas" w:hAnsi="Consolas"/>
+          <w:b/>
+          <w:sz w:val="18"/>
+        </w:rPr>
+        <w:t>new_user_umat_starter/scripts/show_source_lines.py</w:t>
+      </w:r>
+      <w:r>
+        <w:t xml:space="preserve"> — Prints a source range with 1-based line numbers so you can choose replace ranges.</w:t>
+      </w:r>
+    </w:p>
+    <w:p>
+      <w:pPr>
+        <w:pStyle w:val="ListBullet"/>
+      </w:pPr>
+      <w:r>
+        <w:rPr>
+          <w:rFonts w:ascii="Consolas" w:hAnsi="Consolas"/>
+          <w:b/>
+          <w:sz w:val="18"/>
+        </w:rPr>
+        <w:t>new_user_umat_starter/scripts/check_config.py</w:t>
+      </w:r>
+      <w:r>
+        <w:t xml:space="preserve"> — Load-checks a compact JSON contract, resolves the source path, applies anchors, and can write the expanded config.</w:t>
+      </w:r>
+    </w:p>
+    <w:p>
+      <w:pPr>
+        <w:pStyle w:val="ListBullet"/>
+      </w:pPr>
+      <w:r>
+        <w:rPr>
+          <w:rFonts w:ascii="Consolas" w:hAnsi="Consolas"/>
+          <w:b/>
+          <w:sz w:val="18"/>
+        </w:rPr>
+        <w:t>new_user_umat_starter/scripts/run_from_json.py</w:t>
+      </w:r>
+      <w:r>
+        <w:t xml:space="preserve"> — Runs the single-config transform path and writes generated source plus the transform report.</w:t>
       </w:r>
     </w:p>
     <w:p>
@@ -428,26 +1912,54 @@
         <w:pStyle w:val="Heading1"/>
       </w:pPr>
       <w:r>
-        <w:rPr>
-          <w:color w:val="F15A22"/>
-        </w:rPr>
-        <w:t>6. Verifying in Abaqus</w:t>
+        <w:t>6. Graphical User Interface</w:t>
       </w:r>
     </w:p>
     <w:p>
       <w:r>
-        <w:rPr>
-          <w:b w:val="0"/>
-        </w:rPr>
-        <w:t>The Verify in Abaqus button compiles and runs both the original UMAT and the OTI UMAT on a single element, then compares the two tangents. The Abaqus command is a field, so the tool works on any machine: type abaqus, or abq2023, or a full path.</w:t>
+        <w:t>Launch the Streamlit GUI from the bundle directory:</w:t>
       </w:r>
     </w:p>
+    <w:tbl>
+      <w:tblPr>
+        <w:tblW w:type="auto" w:w="0"/>
+        <w:jc w:val="left"/>
+        <w:tblLook w:firstColumn="1" w:firstRow="1" w:lastColumn="0" w:lastRow="0" w:noHBand="0" w:noVBand="1" w:val="04A0"/>
+        <w:tblBorders>
+          <w:top w:val="single" w:sz="4" w:color="D0D0D0"/>
+          <w:left w:val="single" w:sz="4" w:color="D0D0D0"/>
+          <w:bottom w:val="single" w:sz="4" w:color="D0D0D0"/>
+          <w:right w:val="single" w:sz="4" w:color="D0D0D0"/>
+        </w:tblBorders>
+      </w:tblPr>
+      <w:tblGrid>
+        <w:gridCol w:w="8640"/>
+      </w:tblGrid>
+      <w:tr>
+        <w:tc>
+          <w:tcPr>
+            <w:tcW w:type="dxa" w:w="9072"/>
+            <w:shd w:val="clear" w:color="auto" w:fill="F2F2F2"/>
+          </w:tcPr>
+          <w:p>
+            <w:pPr>
+              <w:spacing w:before="40" w:after="40"/>
+            </w:pPr>
+            <w:r>
+              <w:rPr>
+                <w:rFonts w:ascii="Consolas" w:hAnsi="Consolas"/>
+                <w:sz w:val="18"/>
+              </w:rPr>
+              <w:t>streamlit run app.py</w:t>
+            </w:r>
+          </w:p>
+        </w:tc>
+      </w:tr>
+    </w:tbl>
+    <w:p/>
     <w:p>
       <w:r>
-        <w:rPr>
-          <w:b w:val="0"/>
-        </w:rPr>
-        <w:t>The result shows the two DDSDDE matrices side by side and whether they match. Agreement is to single precision, because Abaqus stores state variable output in single precision and the tangent is read back through state variables. The underlying OTI computation is double precision.</w:t>
+        <w:t>The GUI can load a bundled contract from json_files_completed/ or an uploaded JSON file. When uploading JSON through the browser, use an absolute source path on the machine running the app; relative paths are safest when the JSON is loaded directly from disk on that same machine.</w:t>
       </w:r>
     </w:p>
     <w:p>
@@ -455,26 +1967,362 @@
         <w:pStyle w:val="Heading1"/>
       </w:pPr>
       <w:r>
-        <w:rPr>
-          <w:color w:val="F15A22"/>
-        </w:rPr>
-        <w:t>7. The optional AI assist</w:t>
+        <w:t>7. Tutorial: Transforming a New UMAT</w:t>
       </w:r>
     </w:p>
     <w:p>
       <w:r>
-        <w:rPr>
-          <w:b w:val="0"/>
-        </w:rPr>
-        <w:t>A small language model can help in two places: it suggests a role when a variable name is genuinely ambiguous, and it proposes a fix when the generated code does not compile. The model only suggests. Every suggestion is checked by compiling the result and comparing the numbers, so a wrong suggestion is thrown away and the normal result is kept.</w:t>
+        <w:t>Run all commands from the bundle root. Use /usr/bin/python3.12 where the default python is older than 3.10.</w:t>
+      </w:r>
+    </w:p>
+    <w:p>
+      <w:pPr>
+        <w:pStyle w:val="Heading2"/>
+      </w:pPr>
+      <w:r>
+        <w:t>Step 1 — Inspect the source</w:t>
+      </w:r>
+    </w:p>
+    <w:tbl>
+      <w:tblPr>
+        <w:tblW w:type="auto" w:w="0"/>
+        <w:jc w:val="left"/>
+        <w:tblLook w:firstColumn="1" w:firstRow="1" w:lastColumn="0" w:lastRow="0" w:noHBand="0" w:noVBand="1" w:val="04A0"/>
+        <w:tblBorders>
+          <w:top w:val="single" w:sz="4" w:color="D0D0D0"/>
+          <w:left w:val="single" w:sz="4" w:color="D0D0D0"/>
+          <w:bottom w:val="single" w:sz="4" w:color="D0D0D0"/>
+          <w:right w:val="single" w:sz="4" w:color="D0D0D0"/>
+        </w:tblBorders>
+      </w:tblPr>
+      <w:tblGrid>
+        <w:gridCol w:w="8640"/>
+      </w:tblGrid>
+      <w:tr>
+        <w:tc>
+          <w:tcPr>
+            <w:tcW w:type="dxa" w:w="9072"/>
+            <w:shd w:val="clear" w:color="auto" w:fill="F2F2F2"/>
+          </w:tcPr>
+          <w:p>
+            <w:pPr>
+              <w:spacing w:before="40" w:after="40"/>
+            </w:pPr>
+            <w:r>
+              <w:rPr>
+                <w:rFonts w:ascii="Consolas" w:hAnsi="Consolas"/>
+                <w:sz w:val="18"/>
+              </w:rPr>
+              <w:t>python3 new_user_umat_starter/scripts/scan_source.py /abs/path/YOUR_UMAT.for</w:t>
+            </w:r>
+            <w:r>
+              <w:br/>
+            </w:r>
+            <w:r>
+              <w:rPr>
+                <w:rFonts w:ascii="Consolas" w:hAnsi="Consolas"/>
+                <w:sz w:val="18"/>
+              </w:rPr>
+              <w:t>python3 new_user_umat_starter/scripts/show_source_lines.py /abs/path/YOUR_UMAT.for --start 1 --end 220</w:t>
+            </w:r>
+          </w:p>
+        </w:tc>
+      </w:tr>
+    </w:tbl>
+    <w:p/>
+    <w:p>
+      <w:r>
+        <w:t>scan_source.py reports the routines it detects; show_source_lines.py lets you locate the existing DDSDDE assignment block for the replace ranges.</w:t>
+      </w:r>
+    </w:p>
+    <w:p>
+      <w:pPr>
+        <w:pStyle w:val="Heading2"/>
+      </w:pPr>
+      <w:r>
+        <w:t>Step 2 — Copy the minimal template</w:t>
+      </w:r>
+    </w:p>
+    <w:tbl>
+      <w:tblPr>
+        <w:tblW w:type="auto" w:w="0"/>
+        <w:jc w:val="left"/>
+        <w:tblLook w:firstColumn="1" w:firstRow="1" w:lastColumn="0" w:lastRow="0" w:noHBand="0" w:noVBand="1" w:val="04A0"/>
+        <w:tblBorders>
+          <w:top w:val="single" w:sz="4" w:color="D0D0D0"/>
+          <w:left w:val="single" w:sz="4" w:color="D0D0D0"/>
+          <w:bottom w:val="single" w:sz="4" w:color="D0D0D0"/>
+          <w:right w:val="single" w:sz="4" w:color="D0D0D0"/>
+        </w:tblBorders>
+      </w:tblPr>
+      <w:tblGrid>
+        <w:gridCol w:w="8640"/>
+      </w:tblGrid>
+      <w:tr>
+        <w:tc>
+          <w:tcPr>
+            <w:tcW w:type="dxa" w:w="9072"/>
+            <w:shd w:val="clear" w:color="auto" w:fill="F2F2F2"/>
+          </w:tcPr>
+          <w:p>
+            <w:pPr>
+              <w:spacing w:before="40" w:after="40"/>
+            </w:pPr>
+            <w:r>
+              <w:rPr>
+                <w:rFonts w:ascii="Consolas" w:hAnsi="Consolas"/>
+                <w:sz w:val="18"/>
+              </w:rPr>
+              <w:t>cp templates/new_umat_minimal_template.json json_files/my_new_umat.json</w:t>
+            </w:r>
+          </w:p>
+        </w:tc>
+      </w:tr>
+    </w:tbl>
+    <w:p/>
+    <w:p>
+      <w:pPr>
+        <w:pStyle w:val="Heading2"/>
+      </w:pPr>
+      <w:r>
+        <w:t>Step 3 — Fill in the contract</w:t>
       </w:r>
     </w:p>
     <w:p>
       <w:r>
-        <w:rPr>
-          <w:b w:val="0"/>
-        </w:rPr>
-        <w:t>The model runs fully offline on the local GPU, through Ollama. If it is not installed, the tool runs the deterministic path with no loss of correctness. The AI can make hard cases faster, but it can never make the answer wrong.</w:t>
+        <w:t>At minimum set: name, source, jacobian.seed, jacobian.output, jacobian.target, promote, replace, ntens, order.</w:t>
+      </w:r>
+    </w:p>
+    <w:p>
+      <w:pPr>
+        <w:pStyle w:val="Heading2"/>
+      </w:pPr>
+      <w:r>
+        <w:t>Step 4 — Load-check the contract</w:t>
+      </w:r>
+    </w:p>
+    <w:tbl>
+      <w:tblPr>
+        <w:tblW w:type="auto" w:w="0"/>
+        <w:jc w:val="left"/>
+        <w:tblLook w:firstColumn="1" w:firstRow="1" w:lastColumn="0" w:lastRow="0" w:noHBand="0" w:noVBand="1" w:val="04A0"/>
+        <w:tblBorders>
+          <w:top w:val="single" w:sz="4" w:color="D0D0D0"/>
+          <w:left w:val="single" w:sz="4" w:color="D0D0D0"/>
+          <w:bottom w:val="single" w:sz="4" w:color="D0D0D0"/>
+          <w:right w:val="single" w:sz="4" w:color="D0D0D0"/>
+        </w:tblBorders>
+      </w:tblPr>
+      <w:tblGrid>
+        <w:gridCol w:w="8640"/>
+      </w:tblGrid>
+      <w:tr>
+        <w:tc>
+          <w:tcPr>
+            <w:tcW w:type="dxa" w:w="9072"/>
+            <w:shd w:val="clear" w:color="auto" w:fill="F2F2F2"/>
+          </w:tcPr>
+          <w:p>
+            <w:pPr>
+              <w:spacing w:before="40" w:after="40"/>
+            </w:pPr>
+            <w:r>
+              <w:rPr>
+                <w:rFonts w:ascii="Consolas" w:hAnsi="Consolas"/>
+                <w:sz w:val="18"/>
+              </w:rPr>
+              <w:t>python3 new_user_umat_starter/scripts/check_config.py --config json_files/my_new_umat.json</w:t>
+            </w:r>
+          </w:p>
+        </w:tc>
+      </w:tr>
+    </w:tbl>
+    <w:p/>
+    <w:p>
+      <w:r>
+        <w:t>Optionally write the expanded internal config for inspection:</w:t>
+      </w:r>
+    </w:p>
+    <w:tbl>
+      <w:tblPr>
+        <w:tblW w:type="auto" w:w="0"/>
+        <w:jc w:val="left"/>
+        <w:tblLook w:firstColumn="1" w:firstRow="1" w:lastColumn="0" w:lastRow="0" w:noHBand="0" w:noVBand="1" w:val="04A0"/>
+        <w:tblBorders>
+          <w:top w:val="single" w:sz="4" w:color="D0D0D0"/>
+          <w:left w:val="single" w:sz="4" w:color="D0D0D0"/>
+          <w:bottom w:val="single" w:sz="4" w:color="D0D0D0"/>
+          <w:right w:val="single" w:sz="4" w:color="D0D0D0"/>
+        </w:tblBorders>
+      </w:tblPr>
+      <w:tblGrid>
+        <w:gridCol w:w="8640"/>
+      </w:tblGrid>
+      <w:tr>
+        <w:tc>
+          <w:tcPr>
+            <w:tcW w:type="dxa" w:w="9072"/>
+            <w:shd w:val="clear" w:color="auto" w:fill="F2F2F2"/>
+          </w:tcPr>
+          <w:p>
+            <w:pPr>
+              <w:spacing w:before="40" w:after="40"/>
+            </w:pPr>
+            <w:r>
+              <w:rPr>
+                <w:rFonts w:ascii="Consolas" w:hAnsi="Consolas"/>
+                <w:sz w:val="18"/>
+              </w:rPr>
+              <w:t>python3 new_user_umat_starter/scripts/check_config.py \</w:t>
+            </w:r>
+            <w:r>
+              <w:br/>
+            </w:r>
+            <w:r>
+              <w:rPr>
+                <w:rFonts w:ascii="Consolas" w:hAnsi="Consolas"/>
+                <w:sz w:val="18"/>
+              </w:rPr>
+              <w:t xml:space="preserve">  --config json_files/my_new_umat.json \</w:t>
+            </w:r>
+            <w:r>
+              <w:br/>
+            </w:r>
+            <w:r>
+              <w:rPr>
+                <w:rFonts w:ascii="Consolas" w:hAnsi="Consolas"/>
+                <w:sz w:val="18"/>
+              </w:rPr>
+              <w:t xml:space="preserve">  --write-expanded umat_oti_workspace/my_new_umat.expanded.json</w:t>
+            </w:r>
+          </w:p>
+        </w:tc>
+      </w:tr>
+    </w:tbl>
+    <w:p/>
+    <w:p>
+      <w:pPr>
+        <w:pStyle w:val="Heading2"/>
+      </w:pPr>
+      <w:r>
+        <w:t>Step 5 — Run the transform</w:t>
+      </w:r>
+    </w:p>
+    <w:tbl>
+      <w:tblPr>
+        <w:tblW w:type="auto" w:w="0"/>
+        <w:jc w:val="left"/>
+        <w:tblLook w:firstColumn="1" w:firstRow="1" w:lastColumn="0" w:lastRow="0" w:noHBand="0" w:noVBand="1" w:val="04A0"/>
+        <w:tblBorders>
+          <w:top w:val="single" w:sz="4" w:color="D0D0D0"/>
+          <w:left w:val="single" w:sz="4" w:color="D0D0D0"/>
+          <w:bottom w:val="single" w:sz="4" w:color="D0D0D0"/>
+          <w:right w:val="single" w:sz="4" w:color="D0D0D0"/>
+        </w:tblBorders>
+      </w:tblPr>
+      <w:tblGrid>
+        <w:gridCol w:w="8640"/>
+      </w:tblGrid>
+      <w:tr>
+        <w:tc>
+          <w:tcPr>
+            <w:tcW w:type="dxa" w:w="9072"/>
+            <w:shd w:val="clear" w:color="auto" w:fill="F2F2F2"/>
+          </w:tcPr>
+          <w:p>
+            <w:pPr>
+              <w:spacing w:before="40" w:after="40"/>
+            </w:pPr>
+            <w:r>
+              <w:rPr>
+                <w:rFonts w:ascii="Consolas" w:hAnsi="Consolas"/>
+                <w:sz w:val="18"/>
+              </w:rPr>
+              <w:t>python3 new_user_umat_starter/scripts/run_from_json.py \</w:t>
+            </w:r>
+            <w:r>
+              <w:br/>
+            </w:r>
+            <w:r>
+              <w:rPr>
+                <w:rFonts w:ascii="Consolas" w:hAnsi="Consolas"/>
+                <w:sz w:val="18"/>
+              </w:rPr>
+              <w:t xml:space="preserve">  --config json_files/my_new_umat.json \</w:t>
+            </w:r>
+            <w:r>
+              <w:br/>
+            </w:r>
+            <w:r>
+              <w:rPr>
+                <w:rFonts w:ascii="Consolas" w:hAnsi="Consolas"/>
+                <w:sz w:val="18"/>
+              </w:rPr>
+              <w:t xml:space="preserve">  --out umat_oti_workspace/my_new_umat</w:t>
+            </w:r>
+          </w:p>
+        </w:tc>
+      </w:tr>
+    </w:tbl>
+    <w:p/>
+    <w:p>
+      <w:r>
+        <w:t>Or the shortest front door:</w:t>
+      </w:r>
+    </w:p>
+    <w:tbl>
+      <w:tblPr>
+        <w:tblW w:type="auto" w:w="0"/>
+        <w:jc w:val="left"/>
+        <w:tblLook w:firstColumn="1" w:firstRow="1" w:lastColumn="0" w:lastRow="0" w:noHBand="0" w:noVBand="1" w:val="04A0"/>
+        <w:tblBorders>
+          <w:top w:val="single" w:sz="4" w:color="D0D0D0"/>
+          <w:left w:val="single" w:sz="4" w:color="D0D0D0"/>
+          <w:bottom w:val="single" w:sz="4" w:color="D0D0D0"/>
+          <w:right w:val="single" w:sz="4" w:color="D0D0D0"/>
+        </w:tblBorders>
+      </w:tblPr>
+      <w:tblGrid>
+        <w:gridCol w:w="8640"/>
+      </w:tblGrid>
+      <w:tr>
+        <w:tc>
+          <w:tcPr>
+            <w:tcW w:type="dxa" w:w="9072"/>
+            <w:shd w:val="clear" w:color="auto" w:fill="F2F2F2"/>
+          </w:tcPr>
+          <w:p>
+            <w:pPr>
+              <w:spacing w:before="40" w:after="40"/>
+            </w:pPr>
+            <w:r>
+              <w:rPr>
+                <w:rFonts w:ascii="Consolas" w:hAnsi="Consolas"/>
+                <w:sz w:val="18"/>
+              </w:rPr>
+              <w:t>python3 transform_from_json.py json_files/my_new_umat.json --out umat_oti_workspace/my_new_umat</w:t>
+            </w:r>
+          </w:p>
+        </w:tc>
+      </w:tr>
+    </w:tbl>
+    <w:p/>
+    <w:p>
+      <w:r>
+        <w:t>The transformed source and a transform report are written into the chosen output directory.</w:t>
+      </w:r>
+    </w:p>
+    <w:p>
+      <w:pPr>
+        <w:pStyle w:val="Heading2"/>
+      </w:pPr>
+      <w:r>
+        <w:t>Step 6 — (Optional) validate against Abaqus</w:t>
+      </w:r>
+    </w:p>
+    <w:p>
+      <w:r>
+        <w:t>On a machine with Abaqus configured, set RUN_VALIDATION = True in run_json_pipeline.py (or use verify_abaqus_local.py) to compare the transformed UMAT against the original.</w:t>
       </w:r>
     </w:p>
     <w:p>
@@ -482,124 +2330,217 @@
         <w:pStyle w:val="Heading1"/>
       </w:pPr>
       <w:r>
-        <w:rPr>
-          <w:color w:val="F15A22"/>
-        </w:rPr>
-        <w:t>8. Advanced: the JSON contract by hand</w:t>
+        <w:t>8. Examples, Templates, and Benchmark Set</w:t>
+      </w:r>
+    </w:p>
+    <w:p>
+      <w:pPr>
+        <w:pStyle w:val="Heading2"/>
+      </w:pPr>
+      <w:r>
+        <w:t>Templates</w:t>
+      </w:r>
+    </w:p>
+    <w:p>
+      <w:pPr>
+        <w:pStyle w:val="ListBullet"/>
+      </w:pPr>
+      <w:r>
+        <w:t>templates/new_umat_minimal_template.json — standard tangent-only UMAT.</w:t>
+      </w:r>
+    </w:p>
+    <w:p>
+      <w:pPr>
+        <w:pStyle w:val="ListBullet"/>
+      </w:pPr>
+      <w:r>
+        <w:t>templates/new_umat_constitutive_template.json — advanced constitutive_jacobians and helper_surfaces.</w:t>
+      </w:r>
+    </w:p>
+    <w:p>
+      <w:pPr>
+        <w:pStyle w:val="Heading2"/>
+      </w:pPr>
+      <w:r>
+        <w:t>Worked examples</w:t>
+      </w:r>
+    </w:p>
+    <w:p>
+      <w:pPr>
+        <w:pStyle w:val="ListBullet"/>
+      </w:pPr>
+      <w:r>
+        <w:t>examples/elastic_minimal.json — the smallest real reference contract.</w:t>
+      </w:r>
+    </w:p>
+    <w:p>
+      <w:pPr>
+        <w:pStyle w:val="ListBullet"/>
+      </w:pPr>
+      <w:r>
+        <w:t>examples/hin_reference.json — a larger real reference contract.</w:t>
+      </w:r>
+    </w:p>
+    <w:p>
+      <w:pPr>
+        <w:pStyle w:val="Heading2"/>
+      </w:pPr>
+      <w:r>
+        <w:t>Completed benchmark set</w:t>
+      </w:r>
+    </w:p>
+    <w:p>
+      <w:r>
+        <w:t>json_files_completed/ contains 19 completed compact contracts in the current simple format. The bundle transforms all of them successfully. Run the whole set with:</w:t>
+      </w:r>
+    </w:p>
+    <w:tbl>
+      <w:tblPr>
+        <w:tblW w:type="auto" w:w="0"/>
+        <w:jc w:val="left"/>
+        <w:tblLook w:firstColumn="1" w:firstRow="1" w:lastColumn="0" w:lastRow="0" w:noHBand="0" w:noVBand="1" w:val="04A0"/>
+        <w:tblBorders>
+          <w:top w:val="single" w:sz="4" w:color="D0D0D0"/>
+          <w:left w:val="single" w:sz="4" w:color="D0D0D0"/>
+          <w:bottom w:val="single" w:sz="4" w:color="D0D0D0"/>
+          <w:right w:val="single" w:sz="4" w:color="D0D0D0"/>
+        </w:tblBorders>
+      </w:tblPr>
+      <w:tblGrid>
+        <w:gridCol w:w="8640"/>
+      </w:tblGrid>
+      <w:tr>
+        <w:tc>
+          <w:tcPr>
+            <w:tcW w:type="dxa" w:w="9072"/>
+            <w:shd w:val="clear" w:color="auto" w:fill="F2F2F2"/>
+          </w:tcPr>
+          <w:p>
+            <w:pPr>
+              <w:spacing w:before="40" w:after="40"/>
+            </w:pPr>
+            <w:r>
+              <w:rPr>
+                <w:rFonts w:ascii="Consolas" w:hAnsi="Consolas"/>
+                <w:sz w:val="18"/>
+              </w:rPr>
+              <w:t>python3 tools/run_completed_json_batch.py --config-dir json_files_completed --batch-dir umat_oti_workspace/completed_json_batch</w:t>
+            </w:r>
+          </w:p>
+        </w:tc>
+      </w:tr>
+    </w:tbl>
+    <w:p/>
+    <w:p>
+      <w:pPr>
+        <w:pStyle w:val="Heading1"/>
+      </w:pPr>
+      <w:r>
+        <w:t>9. Troubleshooting</w:t>
       </w:r>
     </w:p>
     <w:p>
       <w:r>
         <w:rPr>
-          <w:b w:val="0"/>
+          <w:b/>
         </w:rPr>
-        <w:t>You normally never write this. The interface generates it for you. For batch runs or fine tuning, a single file UMAT can still be driven by a JSON contract from the command line:</w:t>
+        <w:t>Source could not be resolved</w:t>
       </w:r>
     </w:p>
     <w:p>
-      <w:pPr>
-        <w:pStyle w:val="CodeBlock"/>
-        <w:shd w:val="clear" w:fill="F0F0F0"/>
-      </w:pPr>
       <w:r>
-        <w:t>python3 transform_from_json.py user_jsons/my_umat.json \</w:t>
-      </w:r>
-    </w:p>
-    <w:p>
-      <w:pPr>
-        <w:pStyle w:val="CodeBlock"/>
-        <w:shd w:val="clear" w:fill="F0F0F0"/>
-      </w:pPr>
-      <w:r>
-        <w:t xml:space="preserve">    --out umat_oti_workspace/my_umat</w:t>
+        <w:t>Use an absolute source path, or keep the JSON on disk and run check_config.py so relative paths resolve against the JSON file. Browser uploads are safest with absolute paths.</w:t>
       </w:r>
     </w:p>
     <w:p>
       <w:r>
         <w:rPr>
-          <w:b w:val="0"/>
+          <w:b/>
         </w:rPr>
-        <w:t>A minimal contract needs only the Jacobian and the sizes; the tool derives the rest:</w:t>
+        <w:t>Required fields are missing</w:t>
       </w:r>
     </w:p>
     <w:p>
-      <w:pPr>
-        <w:pStyle w:val="CodeBlock"/>
-        <w:shd w:val="clear" w:fill="F0F0F0"/>
-      </w:pPr>
       <w:r>
-        <w:t>{</w:t>
-      </w:r>
-    </w:p>
-    <w:p>
-      <w:pPr>
-        <w:pStyle w:val="CodeBlock"/>
-        <w:shd w:val="clear" w:fill="F0F0F0"/>
-      </w:pPr>
-      <w:r>
-        <w:t xml:space="preserve">  "case_name": "my_umat",</w:t>
-      </w:r>
-    </w:p>
-    <w:p>
-      <w:pPr>
-        <w:pStyle w:val="CodeBlock"/>
-        <w:shd w:val="clear" w:fill="F0F0F0"/>
-      </w:pPr>
-      <w:r>
-        <w:t xml:space="preserve">  "jacobian": { "dependent": "STRESS",</w:t>
-      </w:r>
-    </w:p>
-    <w:p>
-      <w:pPr>
-        <w:pStyle w:val="CodeBlock"/>
-        <w:shd w:val="clear" w:fill="F0F0F0"/>
-      </w:pPr>
-      <w:r>
-        <w:t xml:space="preserve">                "independent": "DSTRAN",</w:t>
-      </w:r>
-    </w:p>
-    <w:p>
-      <w:pPr>
-        <w:pStyle w:val="CodeBlock"/>
-        <w:shd w:val="clear" w:fill="F0F0F0"/>
-      </w:pPr>
-      <w:r>
-        <w:t xml:space="preserve">                "target": "DDSDDE" },</w:t>
-      </w:r>
-    </w:p>
-    <w:p>
-      <w:pPr>
-        <w:pStyle w:val="CodeBlock"/>
-        <w:shd w:val="clear" w:fill="F0F0F0"/>
-      </w:pPr>
-      <w:r>
-        <w:t xml:space="preserve">  "otis": { "ntens": 6, "order": 1 },</w:t>
-      </w:r>
-    </w:p>
-    <w:p>
-      <w:pPr>
-        <w:pStyle w:val="CodeBlock"/>
-        <w:shd w:val="clear" w:fill="F0F0F0"/>
-      </w:pPr>
-      <w:r>
-        <w:t xml:space="preserve">  "source": { "file": "path/to/umat.f" }</w:t>
-      </w:r>
-    </w:p>
-    <w:p>
-      <w:pPr>
-        <w:pStyle w:val="CodeBlock"/>
-        <w:shd w:val="clear" w:fill="F0F0F0"/>
-      </w:pPr>
-      <w:r>
-        <w:t>}</w:t>
+        <w:t>Start from templates/new_umat_minimal_template.json and set every required field before running.</w:t>
       </w:r>
     </w:p>
     <w:p>
       <w:r>
         <w:rPr>
-          <w:b w:val="0"/>
+          <w:b/>
         </w:rPr>
-        <w:t>For finite strain, add a transformation_settings block with seed_dfgrd1 set to true. This seeds the deformation gradient and applies the Abaqus finite strain correction.</w:t>
+        <w:t>A variable has multiple roles</w:t>
+      </w:r>
+    </w:p>
+    <w:p>
+      <w:r>
+        <w:t>Remove the overlap; each variable belongs in only one of promote, constant, or real.</w:t>
+      </w:r>
+    </w:p>
+    <w:p>
+      <w:r>
+        <w:rPr>
+          <w:b/>
+        </w:rPr>
+        <w:t>Anchor status needs_json_completion</w:t>
+      </w:r>
+    </w:p>
+    <w:p>
+      <w:r>
+        <w:t>The JSON loaded but the transform needs more detail. Recheck the replace ranges so they cover exactly the old DDSDDE block, and set umat explicitly if the file has multiple routines.</w:t>
+      </w:r>
+    </w:p>
+    <w:p>
+      <w:r>
+        <w:rPr>
+          <w:b/>
+        </w:rPr>
+        <w:t>Do not know what to put in replace</w:t>
+      </w:r>
+    </w:p>
+    <w:p>
+      <w:r>
+        <w:t>Run show_source_lines.py, find the old DDSDDE assignment block, and add inclusive 1-based ranges like "83-87".</w:t>
+      </w:r>
+    </w:p>
+    <w:p>
+      <w:r>
+        <w:rPr>
+          <w:b/>
+        </w:rPr>
+        <w:t>No UMAT routine detected</w:t>
+      </w:r>
+    </w:p>
+    <w:p>
+      <w:r>
+        <w:t>Confirm the file contains the entry routine; if it is not named UMAT, set the optional umat field.</w:t>
+      </w:r>
+    </w:p>
+    <w:p>
+      <w:r>
+        <w:rPr>
+          <w:b/>
+        </w:rPr>
+        <w:t>Transform returned warnings or failed semantic checks</w:t>
+      </w:r>
+    </w:p>
+    <w:p>
+      <w:r>
+        <w:t>This does not always mean the JSON is wrong. Read the printed report_path, warnings, blockers, and semantic_checks, and compare against the working examples.</w:t>
+      </w:r>
+    </w:p>
+    <w:p>
+      <w:r>
+        <w:rPr>
+          <w:b/>
+        </w:rPr>
+        <w:t>GUI loads the JSON but the transform still fails</w:t>
+      </w:r>
+    </w:p>
+    <w:p>
+      <w:r>
+        <w:t>The JSON/config layer is currently more robust than the transform backend for some benchmark UMATs.</w:t>
       </w:r>
     </w:p>
     <w:p>
@@ -607,10 +2548,7 @@
         <w:pStyle w:val="Heading1"/>
       </w:pPr>
       <w:r>
-        <w:rPr>
-          <w:color w:val="F15A22"/>
-        </w:rPr>
-        <w:t>9. Program outputs</w:t>
+        <w:t>10. Known Limits</w:t>
       </w:r>
     </w:p>
     <w:p>
@@ -618,7 +2556,7 @@
         <w:pStyle w:val="ListBullet"/>
       </w:pPr>
       <w:r>
-        <w:t>The transformed UMAT. It is the original UMAT with the stress computed in OTI and the tangent filled in by DDSDDE(i,j) = GETIM(STRESS_OTI(i), j).</w:t>
+        <w:t>The current workflow is first-order OTI.</w:t>
       </w:r>
     </w:p>
     <w:p>
@@ -626,7 +2564,7 @@
         <w:pStyle w:val="ListBullet"/>
       </w:pPr>
       <w:r>
-        <w:t>A report that lists what the tool detected and whether the transform succeeded.</w:t>
+        <w:t>The transformation targets Abaqus UMAT conventions; local compilation of generated source is only routinely exercised for the bundled example.</w:t>
       </w:r>
     </w:p>
     <w:p>
@@ -634,7 +2572,7 @@
         <w:pStyle w:val="ListBullet"/>
       </w:pPr>
       <w:r>
-        <w:t>When you verify, the two DDSDDE matrices and the match result.</w:t>
+        <w:t>Original-vs-transformed validation requires a configured Abaqus installation.</w:t>
       </w:r>
     </w:p>
     <w:p>
@@ -642,7 +2580,15 @@
         <w:pStyle w:val="ListBullet"/>
       </w:pPr>
       <w:r>
-        <w:t>For higher order runs, the extra derivatives are written to a side file.</w:t>
+        <w:t>Some benchmark UMATs still fail downstream semantic checks even with a valid compact contract; the limitation is in the transform pipeline, not necessarily the JSON.</w:t>
+      </w:r>
+    </w:p>
+    <w:p>
+      <w:pPr>
+        <w:pStyle w:val="ListBullet"/>
+      </w:pPr>
+      <w:r>
+        <w:t>Proprietary Abaqus verification-manual UMATs are not included and must be obtained from a licensed Abaqus installation.</w:t>
       </w:r>
     </w:p>
     <w:p>
@@ -650,162 +2596,19 @@
         <w:pStyle w:val="Heading1"/>
       </w:pPr>
       <w:r>
-        <w:rPr>
-          <w:color w:val="F15A22"/>
-        </w:rPr>
-        <w:t>10. Requirements</w:t>
+        <w:t>11. Citing and License</w:t>
       </w:r>
     </w:p>
-    <w:tbl>
-      <w:tblPr>
-        <w:tblStyle w:val="LightGrid-Accent1"/>
-        <w:tblW w:type="auto" w:w="0"/>
-        <w:tblLook w:firstColumn="1" w:firstRow="1" w:lastColumn="0" w:lastRow="0" w:noHBand="0" w:noVBand="1" w:val="04A0"/>
-      </w:tblPr>
-      <w:tblGrid>
-        <w:gridCol w:w="4320"/>
-        <w:gridCol w:w="4320"/>
-      </w:tblGrid>
-      <w:tr>
-        <w:tc>
-          <w:tcPr>
-            <w:tcW w:type="dxa" w:w="4032"/>
-          </w:tcPr>
-          <w:p>
-            <w:r>
-              <w:rPr>
-                <w:b/>
-              </w:rPr>
-              <w:t>Component</w:t>
-            </w:r>
-          </w:p>
-        </w:tc>
-        <w:tc>
-          <w:tcPr>
-            <w:tcW w:type="dxa" w:w="5328"/>
-          </w:tcPr>
-          <w:p>
-            <w:r>
-              <w:rPr>
-                <w:b/>
-              </w:rPr>
-              <w:t>Needed for</w:t>
-            </w:r>
-          </w:p>
-        </w:tc>
-      </w:tr>
-      <w:tr>
-        <w:tc>
-          <w:tcPr>
-            <w:tcW w:type="dxa" w:w="4032"/>
-          </w:tcPr>
-          <w:p>
-            <w:r>
-              <w:t>Python with Streamlit</w:t>
-            </w:r>
-          </w:p>
-        </w:tc>
-        <w:tc>
-          <w:tcPr>
-            <w:tcW w:type="dxa" w:w="5328"/>
-          </w:tcPr>
-          <w:p>
-            <w:r>
-              <w:t>the single page interface</w:t>
-            </w:r>
-          </w:p>
-        </w:tc>
-      </w:tr>
-      <w:tr>
-        <w:tc>
-          <w:tcPr>
-            <w:tcW w:type="dxa" w:w="4032"/>
-          </w:tcPr>
-          <w:p>
-            <w:r>
-              <w:t>gfortran</w:t>
-            </w:r>
-          </w:p>
-        </w:tc>
-        <w:tc>
-          <w:tcPr>
-            <w:tcW w:type="dxa" w:w="5328"/>
-          </w:tcPr>
-          <w:p>
-            <w:r>
-              <w:t>compiling and checking the generated code</w:t>
-            </w:r>
-          </w:p>
-        </w:tc>
-      </w:tr>
-      <w:tr>
-        <w:tc>
-          <w:tcPr>
-            <w:tcW w:type="dxa" w:w="4032"/>
-          </w:tcPr>
-          <w:p>
-            <w:r>
-              <w:t>Abaqus</w:t>
-            </w:r>
-          </w:p>
-        </w:tc>
-        <w:tc>
-          <w:tcPr>
-            <w:tcW w:type="dxa" w:w="5328"/>
-          </w:tcPr>
-          <w:p>
-            <w:r>
-              <w:t>the Verify in Abaqus step (optional otherwise)</w:t>
-            </w:r>
-          </w:p>
-        </w:tc>
-      </w:tr>
-      <w:tr>
-        <w:tc>
-          <w:tcPr>
-            <w:tcW w:type="dxa" w:w="4032"/>
-          </w:tcPr>
-          <w:p>
-            <w:r>
-              <w:t>The OTI Fortran library</w:t>
-            </w:r>
-          </w:p>
-        </w:tc>
-        <w:tc>
-          <w:tcPr>
-            <w:tcW w:type="dxa" w:w="5328"/>
-          </w:tcPr>
-          <w:p>
-            <w:r>
-              <w:t>the transformed code uses it at compile time</w:t>
-            </w:r>
-          </w:p>
-        </w:tc>
-      </w:tr>
-      <w:tr>
-        <w:tc>
-          <w:tcPr>
-            <w:tcW w:type="dxa" w:w="4032"/>
-          </w:tcPr>
-          <w:p>
-            <w:r>
-              <w:t>Ollama with a local model</w:t>
-            </w:r>
-          </w:p>
-        </w:tc>
-        <w:tc>
-          <w:tcPr>
-            <w:tcW w:type="dxa" w:w="5328"/>
-          </w:tcPr>
-          <w:p>
-            <w:r>
-              <w:t>the optional AI assist (optional)</w:t>
-            </w:r>
-          </w:p>
-        </w:tc>
-      </w:tr>
-    </w:tbl>
-    <w:p/>
+    <w:p>
+      <w:r>
+        <w:t>If you use UMAT-OTI in academic work, please cite it using the metadata in CITATION.cff. Publication details for the accompanying software paper and the archived Zenodo DOI will be added once available.</w:t>
+      </w:r>
+    </w:p>
+    <w:p>
+      <w:r>
+        <w:t>UMAT-OTI is released under the GNU General Public License v3.0 (GPL-3.0-only). It bundles and builds upon template code from the GPL-licensed OTIlib / pyoti library by Mauricio Aristizabal. Because the combined work incorporates GPL-licensed components, UMAT-OTI as a whole is distributed under the GPL-3.0. See COPYRIGHT and THIRD_PARTY_NOTICES.md for authorship and attribution details.</w:t>
+      </w:r>
+    </w:p>
     <w:sectPr>
       <w:pgSz w:w="12240" w:h="15840"/>
       <w:pgMar w:top="1440" w:right="1800" w:bottom="1440" w:left="1800" w:header="720" w:footer="720" w:gutter="0"/>
@@ -1181,7 +2984,6 @@
     <w:rsid w:val="00FC693F"/>
     <w:rPr>
       <w:rFonts w:ascii="Calibri" w:hAnsi="Calibri"/>
-      <w:color w:val="1A1A1A"/>
       <w:sz w:val="22"/>
     </w:rPr>
   </w:style>
@@ -12866,18 +14668,6 @@
         <w:shd w:val="clear" w:color="auto" w:fill="FBCAA2" w:themeFill="accent6" w:themeFillTint="7F"/>
       </w:tcPr>
     </w:tblStylePr>
-  </w:style>
-  <w:style w:type="paragraph" w:customStyle="1" w:styleId="CodeBlock">
-    <w:name w:val="CodeBlock"/>
-    <w:pPr>
-      <w:spacing w:before="60" w:after="120"/>
-      <w:ind w:left="216"/>
-    </w:pPr>
-    <w:rPr>
-      <w:rFonts w:ascii="Consolas" w:hAnsi="Consolas"/>
-      <w:color w:val="202020"/>
-      <w:sz w:val="19"/>
-    </w:rPr>
   </w:style>
 </w:styles>
 </file>

</xml_diff>